<commit_message>
Regenerate checklist docx without mockup-site branding
Co-Authored-By: Claude Fable 5 <noreply@anthropic.com>
</commit_message>
<xml_diff>
--- a/zzz_documentation/06_customer_security_checklist_responses.docx
+++ b/zzz_documentation/06_customer_security_checklist_responses.docx
@@ -5,7 +5,7 @@
     <w:p>
       <w:pPr>
         <w:pStyle w:val="Heading1"/>
-        <w:divId w:val="1865942089"/>
+        <w:divId w:val="1891065320"/>
         <w:rPr>
           <w:rFonts w:ascii="Calibri" w:eastAsia="Times New Roman" w:hAnsi="Calibri" w:cs="Calibri"/>
         </w:rPr>
@@ -14,13 +14,13 @@
         <w:rPr>
           <w:rFonts w:ascii="Calibri" w:eastAsia="Times New Roman" w:hAnsi="Calibri" w:cs="Calibri"/>
         </w:rPr>
-        <w:t>Customer Security Checklist — Eisavant Responses</w:t>
+        <w:t>Security Checklist — Response &amp; Assessment</w:t>
       </w:r>
     </w:p>
     <w:p>
       <w:pPr>
         <w:pStyle w:val="meta"/>
-        <w:divId w:val="1865942089"/>
+        <w:divId w:val="1891065320"/>
         <w:rPr>
           <w:rFonts w:ascii="Calibri" w:hAnsi="Calibri" w:cs="Calibri"/>
         </w:rPr>
@@ -29,13 +29,13 @@
         <w:rPr>
           <w:rFonts w:ascii="Calibri" w:hAnsi="Calibri" w:cs="Calibri"/>
         </w:rPr>
-        <w:t>eisavant.com  |  Prepared July 23, 2026  |  Companion to zzz_documentation/06_customer_security_checklist_responses.md</w:t>
+        <w:t>Prepared July 23, 2026</w:t>
       </w:r>
     </w:p>
     <w:p>
       <w:pPr>
         <w:pStyle w:val="Heading2"/>
-        <w:divId w:val="1865942089"/>
+        <w:divId w:val="1891065320"/>
         <w:rPr>
           <w:rFonts w:ascii="Calibri" w:eastAsia="Times New Roman" w:hAnsi="Calibri" w:cs="Calibri"/>
         </w:rPr>
@@ -50,10 +50,10 @@
     <w:p>
       <w:pPr>
         <w:pStyle w:val="NormalWeb"/>
-        <w:divId w:val="1865942089"/>
+        <w:divId w:val="1891065320"/>
         <w:rPr>
           <w:rFonts w:ascii="Calibri" w:hAnsi="Calibri" w:cs="Calibri"/>
-          <w:color w:val="1C2333"/>
+          <w:color w:val="222222"/>
           <w:sz w:val="22"/>
           <w:szCs w:val="22"/>
         </w:rPr>
@@ -61,18 +61,18 @@
       <w:r>
         <w:rPr>
           <w:rFonts w:ascii="Calibri" w:hAnsi="Calibri" w:cs="Calibri"/>
-          <w:color w:val="1C2333"/>
+          <w:color w:val="222222"/>
           <w:sz w:val="22"/>
           <w:szCs w:val="22"/>
         </w:rPr>
-        <w:t xml:space="preserve">A consultant's security checklist was shared with us. It is written for applications built on </w:t>
+        <w:t xml:space="preserve">The security checklist provided is written for applications built on </w:t>
       </w:r>
       <w:r>
         <w:rPr>
           <w:rFonts w:ascii="Calibri" w:hAnsi="Calibri" w:cs="Calibri"/>
           <w:b/>
           <w:bCs/>
-          <w:color w:val="1C2333"/>
+          <w:color w:val="222222"/>
           <w:sz w:val="22"/>
           <w:szCs w:val="22"/>
         </w:rPr>
@@ -81,18 +81,18 @@
       <w:r>
         <w:rPr>
           <w:rFonts w:ascii="Calibri" w:hAnsi="Calibri" w:cs="Calibri"/>
-          <w:color w:val="1C2333"/>
+          <w:color w:val="222222"/>
           <w:sz w:val="22"/>
           <w:szCs w:val="22"/>
         </w:rPr>
-        <w:t xml:space="preserve">, where the database is exposed through an auto-generated API and security depends on correctly configured Supabase policies. Eisavant is </w:t>
+        <w:t xml:space="preserve">, where the database is exposed through an auto-generated API and security depends on correctly configured Supabase policies. The platform architecture we are proposing is </w:t>
       </w:r>
       <w:r>
         <w:rPr>
           <w:rFonts w:ascii="Calibri" w:hAnsi="Calibri" w:cs="Calibri"/>
           <w:b/>
           <w:bCs/>
-          <w:color w:val="1C2333"/>
+          <w:color w:val="222222"/>
           <w:sz w:val="22"/>
           <w:szCs w:val="22"/>
         </w:rPr>
@@ -101,7 +101,7 @@
       <w:r>
         <w:rPr>
           <w:rFonts w:ascii="Calibri" w:hAnsi="Calibri" w:cs="Calibri"/>
-          <w:color w:val="1C2333"/>
+          <w:color w:val="222222"/>
           <w:sz w:val="22"/>
           <w:szCs w:val="22"/>
         </w:rPr>
@@ -110,18 +110,18 @@
       <w:r>
         <w:rPr>
           <w:rFonts w:ascii="Calibri" w:hAnsi="Calibri" w:cs="Calibri"/>
-          <w:color w:val="1C2333"/>
+          <w:color w:val="222222"/>
           <w:sz w:val="22"/>
           <w:szCs w:val="22"/>
         </w:rPr>
-        <w:t xml:space="preserve">built on Supabase: it is a custom Express/TypeScript API in front of PostgreSQL on Railway, and the database is never directly reachable from a browser. That architectural difference resolves several checklist items by construction. The checklist is </w:t>
+        <w:t xml:space="preserve">built on Supabase: it is a custom Express/TypeScript API in front of PostgreSQL hosted on Railway, and the database is never directly reachable from a browser. That architectural difference resolves several checklist items by construction. The checklist is </w:t>
       </w:r>
       <w:r>
         <w:rPr>
           <w:rFonts w:ascii="Calibri" w:hAnsi="Calibri" w:cs="Calibri"/>
           <w:i/>
           <w:iCs/>
-          <w:color w:val="1C2333"/>
+          <w:color w:val="222222"/>
           <w:sz w:val="22"/>
           <w:szCs w:val="22"/>
         </w:rPr>
@@ -130,20 +130,20 @@
       <w:r>
         <w:rPr>
           <w:rFonts w:ascii="Calibri" w:hAnsi="Calibri" w:cs="Calibri"/>
-          <w:color w:val="1C2333"/>
+          <w:color w:val="222222"/>
           <w:sz w:val="22"/>
           <w:szCs w:val="22"/>
         </w:rPr>
-        <w:t xml:space="preserve"> — none of it is noise — but for this codebase most items are already implemented, and items 1–3 are continuously re-verified by an automated test suite rather than checked by hand.</w:t>
+        <w:t xml:space="preserve"> — none of it is noise — but in this architecture most items are already implemented, and items 1–3 are continuously re-verified by an automated test suite rather than checked by hand.</w:t>
       </w:r>
     </w:p>
     <w:p>
       <w:pPr>
         <w:pStyle w:val="NormalWeb"/>
-        <w:divId w:val="1865942089"/>
+        <w:divId w:val="1891065320"/>
         <w:rPr>
           <w:rFonts w:ascii="Calibri" w:hAnsi="Calibri" w:cs="Calibri"/>
-          <w:color w:val="1C2333"/>
+          <w:color w:val="222222"/>
           <w:sz w:val="22"/>
           <w:szCs w:val="22"/>
         </w:rPr>
@@ -153,7 +153,7 @@
           <w:rFonts w:ascii="Calibri" w:hAnsi="Calibri" w:cs="Calibri"/>
           <w:b/>
           <w:bCs/>
-          <w:color w:val="1C2333"/>
+          <w:color w:val="222222"/>
           <w:sz w:val="22"/>
           <w:szCs w:val="22"/>
         </w:rPr>
@@ -162,7 +162,7 @@
       <w:r>
         <w:rPr>
           <w:rFonts w:ascii="Calibri" w:hAnsi="Calibri" w:cs="Calibri"/>
-          <w:color w:val="1C2333"/>
+          <w:color w:val="222222"/>
           <w:sz w:val="22"/>
           <w:szCs w:val="22"/>
         </w:rPr>
@@ -171,7 +171,7 @@
       <w:r>
         <w:rPr>
           <w:rFonts w:ascii="Calibri" w:hAnsi="Calibri" w:cs="Calibri"/>
-          <w:color w:val="1C2333"/>
+          <w:color w:val="222222"/>
           <w:sz w:val="22"/>
           <w:szCs w:val="22"/>
         </w:rPr>
@@ -181,7 +181,7 @@
     <w:p>
       <w:pPr>
         <w:pStyle w:val="Heading2"/>
-        <w:divId w:val="1865942089"/>
+        <w:divId w:val="1891065320"/>
         <w:rPr>
           <w:rFonts w:ascii="Calibri" w:eastAsia="Times New Roman" w:hAnsi="Calibri" w:cs="Calibri"/>
         </w:rPr>
@@ -206,18 +206,18 @@
       </w:tblPr>
       <w:tblGrid>
         <w:gridCol w:w="364"/>
-        <w:gridCol w:w="2202"/>
-        <w:gridCol w:w="5722"/>
+        <w:gridCol w:w="2129"/>
+        <w:gridCol w:w="5795"/>
         <w:gridCol w:w="1072"/>
       </w:tblGrid>
       <w:tr>
         <w:trPr>
-          <w:divId w:val="1865942089"/>
+          <w:divId w:val="1891065320"/>
         </w:trPr>
         <w:tc>
           <w:tcPr>
             <w:tcW w:w="0" w:type="auto"/>
-            <w:shd w:val="clear" w:color="auto" w:fill="0A1128"/>
+            <w:shd w:val="clear" w:color="auto" w:fill="1F3352"/>
             <w:tcMar>
               <w:top w:w="90" w:type="dxa"/>
               <w:left w:w="120" w:type="dxa"/>
@@ -234,17 +234,17 @@
                 <w:rFonts w:ascii="Calibri" w:eastAsia="Times New Roman" w:hAnsi="Calibri" w:cs="Calibri"/>
                 <w:b/>
                 <w:bCs/>
-                <w:color w:val="E8CC6E"/>
-                <w:sz w:val="20"/>
-                <w:szCs w:val="20"/>
-              </w:rPr>
-            </w:pPr>
-            <w:r>
-              <w:rPr>
-                <w:rFonts w:ascii="Calibri" w:eastAsia="Times New Roman" w:hAnsi="Calibri" w:cs="Calibri"/>
-                <w:b/>
-                <w:bCs/>
-                <w:color w:val="E8CC6E"/>
+                <w:color w:val="FFFFFF"/>
+                <w:sz w:val="20"/>
+                <w:szCs w:val="20"/>
+              </w:rPr>
+            </w:pPr>
+            <w:r>
+              <w:rPr>
+                <w:rFonts w:ascii="Calibri" w:eastAsia="Times New Roman" w:hAnsi="Calibri" w:cs="Calibri"/>
+                <w:b/>
+                <w:bCs/>
+                <w:color w:val="FFFFFF"/>
                 <w:sz w:val="20"/>
                 <w:szCs w:val="20"/>
               </w:rPr>
@@ -255,7 +255,7 @@
         <w:tc>
           <w:tcPr>
             <w:tcW w:w="0" w:type="auto"/>
-            <w:shd w:val="clear" w:color="auto" w:fill="0A1128"/>
+            <w:shd w:val="clear" w:color="auto" w:fill="1F3352"/>
             <w:tcMar>
               <w:top w:w="90" w:type="dxa"/>
               <w:left w:w="120" w:type="dxa"/>
@@ -272,17 +272,17 @@
                 <w:rFonts w:ascii="Calibri" w:eastAsia="Times New Roman" w:hAnsi="Calibri" w:cs="Calibri"/>
                 <w:b/>
                 <w:bCs/>
-                <w:color w:val="E8CC6E"/>
-                <w:sz w:val="20"/>
-                <w:szCs w:val="20"/>
-              </w:rPr>
-            </w:pPr>
-            <w:r>
-              <w:rPr>
-                <w:rFonts w:ascii="Calibri" w:eastAsia="Times New Roman" w:hAnsi="Calibri" w:cs="Calibri"/>
-                <w:b/>
-                <w:bCs/>
-                <w:color w:val="E8CC6E"/>
+                <w:color w:val="FFFFFF"/>
+                <w:sz w:val="20"/>
+                <w:szCs w:val="20"/>
+              </w:rPr>
+            </w:pPr>
+            <w:r>
+              <w:rPr>
+                <w:rFonts w:ascii="Calibri" w:eastAsia="Times New Roman" w:hAnsi="Calibri" w:cs="Calibri"/>
+                <w:b/>
+                <w:bCs/>
+                <w:color w:val="FFFFFF"/>
                 <w:sz w:val="20"/>
                 <w:szCs w:val="20"/>
               </w:rPr>
@@ -293,7 +293,7 @@
         <w:tc>
           <w:tcPr>
             <w:tcW w:w="0" w:type="auto"/>
-            <w:shd w:val="clear" w:color="auto" w:fill="0A1128"/>
+            <w:shd w:val="clear" w:color="auto" w:fill="1F3352"/>
             <w:tcMar>
               <w:top w:w="90" w:type="dxa"/>
               <w:left w:w="120" w:type="dxa"/>
@@ -310,28 +310,28 @@
                 <w:rFonts w:ascii="Calibri" w:eastAsia="Times New Roman" w:hAnsi="Calibri" w:cs="Calibri"/>
                 <w:b/>
                 <w:bCs/>
-                <w:color w:val="E8CC6E"/>
-                <w:sz w:val="20"/>
-                <w:szCs w:val="20"/>
-              </w:rPr>
-            </w:pPr>
-            <w:r>
-              <w:rPr>
-                <w:rFonts w:ascii="Calibri" w:eastAsia="Times New Roman" w:hAnsi="Calibri" w:cs="Calibri"/>
-                <w:b/>
-                <w:bCs/>
-                <w:color w:val="E8CC6E"/>
-                <w:sz w:val="20"/>
-                <w:szCs w:val="20"/>
-              </w:rPr>
-              <w:t>Eisavant response</w:t>
-            </w:r>
-          </w:p>
-        </w:tc>
-        <w:tc>
-          <w:tcPr>
-            <w:tcW w:w="0" w:type="auto"/>
-            <w:shd w:val="clear" w:color="auto" w:fill="0A1128"/>
+                <w:color w:val="FFFFFF"/>
+                <w:sz w:val="20"/>
+                <w:szCs w:val="20"/>
+              </w:rPr>
+            </w:pPr>
+            <w:r>
+              <w:rPr>
+                <w:rFonts w:ascii="Calibri" w:eastAsia="Times New Roman" w:hAnsi="Calibri" w:cs="Calibri"/>
+                <w:b/>
+                <w:bCs/>
+                <w:color w:val="FFFFFF"/>
+                <w:sz w:val="20"/>
+                <w:szCs w:val="20"/>
+              </w:rPr>
+              <w:t>Response</w:t>
+            </w:r>
+          </w:p>
+        </w:tc>
+        <w:tc>
+          <w:tcPr>
+            <w:tcW w:w="0" w:type="auto"/>
+            <w:shd w:val="clear" w:color="auto" w:fill="1F3352"/>
             <w:tcMar>
               <w:top w:w="90" w:type="dxa"/>
               <w:left w:w="120" w:type="dxa"/>
@@ -348,17 +348,17 @@
                 <w:rFonts w:ascii="Calibri" w:eastAsia="Times New Roman" w:hAnsi="Calibri" w:cs="Calibri"/>
                 <w:b/>
                 <w:bCs/>
-                <w:color w:val="E8CC6E"/>
-                <w:sz w:val="20"/>
-                <w:szCs w:val="20"/>
-              </w:rPr>
-            </w:pPr>
-            <w:r>
-              <w:rPr>
-                <w:rFonts w:ascii="Calibri" w:eastAsia="Times New Roman" w:hAnsi="Calibri" w:cs="Calibri"/>
-                <w:b/>
-                <w:bCs/>
-                <w:color w:val="E8CC6E"/>
+                <w:color w:val="FFFFFF"/>
+                <w:sz w:val="20"/>
+                <w:szCs w:val="20"/>
+              </w:rPr>
+            </w:pPr>
+            <w:r>
+              <w:rPr>
+                <w:rFonts w:ascii="Calibri" w:eastAsia="Times New Roman" w:hAnsi="Calibri" w:cs="Calibri"/>
+                <w:b/>
+                <w:bCs/>
+                <w:color w:val="FFFFFF"/>
                 <w:sz w:val="20"/>
                 <w:szCs w:val="20"/>
               </w:rPr>
@@ -369,7 +369,7 @@
       </w:tr>
       <w:tr>
         <w:trPr>
-          <w:divId w:val="1865942089"/>
+          <w:divId w:val="1891065320"/>
         </w:trPr>
         <w:tc>
           <w:tcPr>
@@ -393,15 +393,15 @@
               <w:spacing w:before="180" w:after="180"/>
               <w:rPr>
                 <w:rFonts w:ascii="Calibri" w:eastAsia="Times New Roman" w:hAnsi="Calibri" w:cs="Calibri"/>
-                <w:color w:val="1C2333"/>
-                <w:sz w:val="20"/>
-                <w:szCs w:val="20"/>
-              </w:rPr>
-            </w:pPr>
-            <w:r>
-              <w:rPr>
-                <w:rFonts w:ascii="Calibri" w:eastAsia="Times New Roman" w:hAnsi="Calibri" w:cs="Calibri"/>
-                <w:color w:val="1C2333"/>
+                <w:color w:val="222222"/>
+                <w:sz w:val="20"/>
+                <w:szCs w:val="20"/>
+              </w:rPr>
+            </w:pPr>
+            <w:r>
+              <w:rPr>
+                <w:rFonts w:ascii="Calibri" w:eastAsia="Times New Roman" w:hAnsi="Calibri" w:cs="Calibri"/>
+                <w:color w:val="222222"/>
                 <w:sz w:val="20"/>
                 <w:szCs w:val="20"/>
               </w:rPr>
@@ -431,15 +431,15 @@
               <w:spacing w:before="180" w:after="180"/>
               <w:rPr>
                 <w:rFonts w:ascii="Calibri" w:eastAsia="Times New Roman" w:hAnsi="Calibri" w:cs="Calibri"/>
-                <w:color w:val="1C2333"/>
-                <w:sz w:val="20"/>
-                <w:szCs w:val="20"/>
-              </w:rPr>
-            </w:pPr>
-            <w:r>
-              <w:rPr>
-                <w:rFonts w:ascii="Calibri" w:eastAsia="Times New Roman" w:hAnsi="Calibri" w:cs="Calibri"/>
-                <w:color w:val="1C2333"/>
+                <w:color w:val="222222"/>
+                <w:sz w:val="20"/>
+                <w:szCs w:val="20"/>
+              </w:rPr>
+            </w:pPr>
+            <w:r>
+              <w:rPr>
+                <w:rFonts w:ascii="Calibri" w:eastAsia="Times New Roman" w:hAnsi="Calibri" w:cs="Calibri"/>
+                <w:color w:val="222222"/>
                 <w:sz w:val="20"/>
                 <w:szCs w:val="20"/>
               </w:rPr>
@@ -469,15 +469,15 @@
               <w:spacing w:before="180" w:after="180"/>
               <w:rPr>
                 <w:rFonts w:ascii="Calibri" w:eastAsia="Times New Roman" w:hAnsi="Calibri" w:cs="Calibri"/>
-                <w:color w:val="1C2333"/>
-                <w:sz w:val="20"/>
-                <w:szCs w:val="20"/>
-              </w:rPr>
-            </w:pPr>
-            <w:r>
-              <w:rPr>
-                <w:rFonts w:ascii="Calibri" w:eastAsia="Times New Roman" w:hAnsi="Calibri" w:cs="Calibri"/>
-                <w:color w:val="1C2333"/>
+                <w:color w:val="222222"/>
+                <w:sz w:val="20"/>
+                <w:szCs w:val="20"/>
+              </w:rPr>
+            </w:pPr>
+            <w:r>
+              <w:rPr>
+                <w:rFonts w:ascii="Calibri" w:eastAsia="Times New Roman" w:hAnsi="Calibri" w:cs="Calibri"/>
+                <w:color w:val="222222"/>
                 <w:sz w:val="20"/>
                 <w:szCs w:val="20"/>
               </w:rPr>
@@ -488,7 +488,7 @@
                 <w:rFonts w:ascii="Calibri" w:eastAsia="Times New Roman" w:hAnsi="Calibri" w:cs="Calibri"/>
                 <w:b/>
                 <w:bCs/>
-                <w:color w:val="1C2333"/>
+                <w:color w:val="222222"/>
                 <w:sz w:val="20"/>
                 <w:szCs w:val="20"/>
               </w:rPr>
@@ -497,11 +497,11 @@
             <w:r>
               <w:rPr>
                 <w:rFonts w:ascii="Calibri" w:eastAsia="Times New Roman" w:hAnsi="Calibri" w:cs="Calibri"/>
-                <w:color w:val="1C2333"/>
-                <w:sz w:val="20"/>
-                <w:szCs w:val="20"/>
-              </w:rPr>
-              <w:t xml:space="preserve"> application table with deny-by-default, hand-written policies per role (anon, ceo, support, admin, client). Full policy matrix in the Database &amp; RLS document.</w:t>
+                <w:color w:val="222222"/>
+                <w:sz w:val="20"/>
+                <w:szCs w:val="20"/>
+              </w:rPr>
+              <w:t xml:space="preserve"> application table with deny-by-default, hand-written policies per role (anonymous, member, support, admin, client).</w:t>
             </w:r>
           </w:p>
         </w:tc>
@@ -530,17 +530,17 @@
                 <w:rFonts w:ascii="Calibri" w:eastAsia="Times New Roman" w:hAnsi="Calibri" w:cs="Calibri"/>
                 <w:b/>
                 <w:bCs/>
-                <w:color w:val="1C2333"/>
-                <w:sz w:val="20"/>
-                <w:szCs w:val="20"/>
-              </w:rPr>
-            </w:pPr>
-            <w:r>
-              <w:rPr>
-                <w:rFonts w:ascii="Calibri" w:eastAsia="Times New Roman" w:hAnsi="Calibri" w:cs="Calibri"/>
-                <w:b/>
-                <w:bCs/>
-                <w:color w:val="1C2333"/>
+                <w:color w:val="222222"/>
+                <w:sz w:val="20"/>
+                <w:szCs w:val="20"/>
+              </w:rPr>
+            </w:pPr>
+            <w:r>
+              <w:rPr>
+                <w:rFonts w:ascii="Calibri" w:eastAsia="Times New Roman" w:hAnsi="Calibri" w:cs="Calibri"/>
+                <w:b/>
+                <w:bCs/>
+                <w:color w:val="222222"/>
                 <w:sz w:val="20"/>
                 <w:szCs w:val="20"/>
               </w:rPr>
@@ -551,7 +551,7 @@
       </w:tr>
       <w:tr>
         <w:trPr>
-          <w:divId w:val="1865942089"/>
+          <w:divId w:val="1891065320"/>
         </w:trPr>
         <w:tc>
           <w:tcPr>
@@ -575,15 +575,15 @@
               <w:spacing w:before="180" w:after="180"/>
               <w:rPr>
                 <w:rFonts w:ascii="Calibri" w:eastAsia="Times New Roman" w:hAnsi="Calibri" w:cs="Calibri"/>
-                <w:color w:val="1C2333"/>
-                <w:sz w:val="20"/>
-                <w:szCs w:val="20"/>
-              </w:rPr>
-            </w:pPr>
-            <w:r>
-              <w:rPr>
-                <w:rFonts w:ascii="Calibri" w:eastAsia="Times New Roman" w:hAnsi="Calibri" w:cs="Calibri"/>
-                <w:color w:val="1C2333"/>
+                <w:color w:val="222222"/>
+                <w:sz w:val="20"/>
+                <w:szCs w:val="20"/>
+              </w:rPr>
+            </w:pPr>
+            <w:r>
+              <w:rPr>
+                <w:rFonts w:ascii="Calibri" w:eastAsia="Times New Roman" w:hAnsi="Calibri" w:cs="Calibri"/>
+                <w:color w:val="222222"/>
                 <w:sz w:val="20"/>
                 <w:szCs w:val="20"/>
               </w:rPr>
@@ -613,15 +613,15 @@
               <w:spacing w:before="180" w:after="180"/>
               <w:rPr>
                 <w:rFonts w:ascii="Calibri" w:eastAsia="Times New Roman" w:hAnsi="Calibri" w:cs="Calibri"/>
-                <w:color w:val="1C2333"/>
-                <w:sz w:val="20"/>
-                <w:szCs w:val="20"/>
-              </w:rPr>
-            </w:pPr>
-            <w:r>
-              <w:rPr>
-                <w:rFonts w:ascii="Calibri" w:eastAsia="Times New Roman" w:hAnsi="Calibri" w:cs="Calibri"/>
-                <w:color w:val="1C2333"/>
+                <w:color w:val="222222"/>
+                <w:sz w:val="20"/>
+                <w:szCs w:val="20"/>
+              </w:rPr>
+            </w:pPr>
+            <w:r>
+              <w:rPr>
+                <w:rFonts w:ascii="Calibri" w:eastAsia="Times New Roman" w:hAnsi="Calibri" w:cs="Calibri"/>
+                <w:color w:val="222222"/>
                 <w:sz w:val="20"/>
                 <w:szCs w:val="20"/>
               </w:rPr>
@@ -651,15 +651,15 @@
               <w:spacing w:before="180" w:after="180"/>
               <w:rPr>
                 <w:rFonts w:ascii="Calibri" w:eastAsia="Times New Roman" w:hAnsi="Calibri" w:cs="Calibri"/>
-                <w:color w:val="1C2333"/>
-                <w:sz w:val="20"/>
-                <w:szCs w:val="20"/>
-              </w:rPr>
-            </w:pPr>
-            <w:r>
-              <w:rPr>
-                <w:rFonts w:ascii="Calibri" w:eastAsia="Times New Roman" w:hAnsi="Calibri" w:cs="Calibri"/>
-                <w:color w:val="1C2333"/>
+                <w:color w:val="222222"/>
+                <w:sz w:val="20"/>
+                <w:szCs w:val="20"/>
+              </w:rPr>
+            </w:pPr>
+            <w:r>
+              <w:rPr>
+                <w:rFonts w:ascii="Calibri" w:eastAsia="Times New Roman" w:hAnsi="Calibri" w:cs="Calibri"/>
+                <w:color w:val="222222"/>
                 <w:sz w:val="20"/>
                 <w:szCs w:val="20"/>
               </w:rPr>
@@ -670,7 +670,7 @@
                 <w:rFonts w:ascii="Calibri" w:eastAsia="Times New Roman" w:hAnsi="Calibri" w:cs="Calibri"/>
                 <w:b/>
                 <w:bCs/>
-                <w:color w:val="1C2333"/>
+                <w:color w:val="222222"/>
                 <w:sz w:val="20"/>
                 <w:szCs w:val="20"/>
               </w:rPr>
@@ -679,11 +679,11 @@
             <w:r>
               <w:rPr>
                 <w:rFonts w:ascii="Calibri" w:eastAsia="Times New Roman" w:hAnsi="Calibri" w:cs="Calibri"/>
-                <w:color w:val="1C2333"/>
-                <w:sz w:val="20"/>
-                <w:szCs w:val="20"/>
-              </w:rPr>
-              <w:t xml:space="preserve"> database credentials. Owner credentials are used only by migration/seed scripts from a gitignored .env; the running app uses a restricted NOBYPASSRLS role.</w:t>
+                <w:color w:val="222222"/>
+                <w:sz w:val="20"/>
+                <w:szCs w:val="20"/>
+              </w:rPr>
+              <w:t xml:space="preserve"> database credentials. Owner credentials are used only by migration/seed scripts from a git-ignored environment file; the running app uses a restricted NOBYPASSRLS database role.</w:t>
             </w:r>
           </w:p>
         </w:tc>
@@ -712,17 +712,17 @@
                 <w:rFonts w:ascii="Calibri" w:eastAsia="Times New Roman" w:hAnsi="Calibri" w:cs="Calibri"/>
                 <w:b/>
                 <w:bCs/>
-                <w:color w:val="1C2333"/>
-                <w:sz w:val="20"/>
-                <w:szCs w:val="20"/>
-              </w:rPr>
-            </w:pPr>
-            <w:r>
-              <w:rPr>
-                <w:rFonts w:ascii="Calibri" w:eastAsia="Times New Roman" w:hAnsi="Calibri" w:cs="Calibri"/>
-                <w:b/>
-                <w:bCs/>
-                <w:color w:val="1C2333"/>
+                <w:color w:val="222222"/>
+                <w:sz w:val="20"/>
+                <w:szCs w:val="20"/>
+              </w:rPr>
+            </w:pPr>
+            <w:r>
+              <w:rPr>
+                <w:rFonts w:ascii="Calibri" w:eastAsia="Times New Roman" w:hAnsi="Calibri" w:cs="Calibri"/>
+                <w:b/>
+                <w:bCs/>
+                <w:color w:val="222222"/>
                 <w:sz w:val="20"/>
                 <w:szCs w:val="20"/>
               </w:rPr>
@@ -733,7 +733,7 @@
       </w:tr>
       <w:tr>
         <w:trPr>
-          <w:divId w:val="1865942089"/>
+          <w:divId w:val="1891065320"/>
         </w:trPr>
         <w:tc>
           <w:tcPr>
@@ -757,15 +757,15 @@
               <w:spacing w:before="180" w:after="180"/>
               <w:rPr>
                 <w:rFonts w:ascii="Calibri" w:eastAsia="Times New Roman" w:hAnsi="Calibri" w:cs="Calibri"/>
-                <w:color w:val="1C2333"/>
-                <w:sz w:val="20"/>
-                <w:szCs w:val="20"/>
-              </w:rPr>
-            </w:pPr>
-            <w:r>
-              <w:rPr>
-                <w:rFonts w:ascii="Calibri" w:eastAsia="Times New Roman" w:hAnsi="Calibri" w:cs="Calibri"/>
-                <w:color w:val="1C2333"/>
+                <w:color w:val="222222"/>
+                <w:sz w:val="20"/>
+                <w:szCs w:val="20"/>
+              </w:rPr>
+            </w:pPr>
+            <w:r>
+              <w:rPr>
+                <w:rFonts w:ascii="Calibri" w:eastAsia="Times New Roman" w:hAnsi="Calibri" w:cs="Calibri"/>
+                <w:color w:val="222222"/>
                 <w:sz w:val="20"/>
                 <w:szCs w:val="20"/>
               </w:rPr>
@@ -795,15 +795,15 @@
               <w:spacing w:before="180" w:after="180"/>
               <w:rPr>
                 <w:rFonts w:ascii="Calibri" w:eastAsia="Times New Roman" w:hAnsi="Calibri" w:cs="Calibri"/>
-                <w:color w:val="1C2333"/>
-                <w:sz w:val="20"/>
-                <w:szCs w:val="20"/>
-              </w:rPr>
-            </w:pPr>
-            <w:r>
-              <w:rPr>
-                <w:rFonts w:ascii="Calibri" w:eastAsia="Times New Roman" w:hAnsi="Calibri" w:cs="Calibri"/>
-                <w:color w:val="1C2333"/>
+                <w:color w:val="222222"/>
+                <w:sz w:val="20"/>
+                <w:szCs w:val="20"/>
+              </w:rPr>
+            </w:pPr>
+            <w:r>
+              <w:rPr>
+                <w:rFonts w:ascii="Calibri" w:eastAsia="Times New Roman" w:hAnsi="Calibri" w:cs="Calibri"/>
+                <w:color w:val="222222"/>
                 <w:sz w:val="20"/>
                 <w:szCs w:val="20"/>
               </w:rPr>
@@ -833,15 +833,15 @@
               <w:spacing w:before="180" w:after="180"/>
               <w:rPr>
                 <w:rFonts w:ascii="Calibri" w:eastAsia="Times New Roman" w:hAnsi="Calibri" w:cs="Calibri"/>
-                <w:color w:val="1C2333"/>
-                <w:sz w:val="20"/>
-                <w:szCs w:val="20"/>
-              </w:rPr>
-            </w:pPr>
-            <w:r>
-              <w:rPr>
-                <w:rFonts w:ascii="Calibri" w:eastAsia="Times New Roman" w:hAnsi="Calibri" w:cs="Calibri"/>
-                <w:color w:val="1C2333"/>
+                <w:color w:val="222222"/>
+                <w:sz w:val="20"/>
+                <w:szCs w:val="20"/>
+              </w:rPr>
+            </w:pPr>
+            <w:r>
+              <w:rPr>
+                <w:rFonts w:ascii="Calibri" w:eastAsia="Times New Roman" w:hAnsi="Calibri" w:cs="Calibri"/>
+                <w:color w:val="222222"/>
                 <w:sz w:val="20"/>
                 <w:szCs w:val="20"/>
               </w:rPr>
@@ -874,17 +874,17 @@
                 <w:rFonts w:ascii="Calibri" w:eastAsia="Times New Roman" w:hAnsi="Calibri" w:cs="Calibri"/>
                 <w:b/>
                 <w:bCs/>
-                <w:color w:val="1C2333"/>
-                <w:sz w:val="20"/>
-                <w:szCs w:val="20"/>
-              </w:rPr>
-            </w:pPr>
-            <w:r>
-              <w:rPr>
-                <w:rFonts w:ascii="Calibri" w:eastAsia="Times New Roman" w:hAnsi="Calibri" w:cs="Calibri"/>
-                <w:b/>
-                <w:bCs/>
-                <w:color w:val="1C2333"/>
+                <w:color w:val="222222"/>
+                <w:sz w:val="20"/>
+                <w:szCs w:val="20"/>
+              </w:rPr>
+            </w:pPr>
+            <w:r>
+              <w:rPr>
+                <w:rFonts w:ascii="Calibri" w:eastAsia="Times New Roman" w:hAnsi="Calibri" w:cs="Calibri"/>
+                <w:b/>
+                <w:bCs/>
+                <w:color w:val="222222"/>
                 <w:sz w:val="20"/>
                 <w:szCs w:val="20"/>
               </w:rPr>
@@ -895,7 +895,7 @@
       </w:tr>
       <w:tr>
         <w:trPr>
-          <w:divId w:val="1865942089"/>
+          <w:divId w:val="1891065320"/>
         </w:trPr>
         <w:tc>
           <w:tcPr>
@@ -919,15 +919,15 @@
               <w:spacing w:before="180" w:after="180"/>
               <w:rPr>
                 <w:rFonts w:ascii="Calibri" w:eastAsia="Times New Roman" w:hAnsi="Calibri" w:cs="Calibri"/>
-                <w:color w:val="1C2333"/>
-                <w:sz w:val="20"/>
-                <w:szCs w:val="20"/>
-              </w:rPr>
-            </w:pPr>
-            <w:r>
-              <w:rPr>
-                <w:rFonts w:ascii="Calibri" w:eastAsia="Times New Roman" w:hAnsi="Calibri" w:cs="Calibri"/>
-                <w:color w:val="1C2333"/>
+                <w:color w:val="222222"/>
+                <w:sz w:val="20"/>
+                <w:szCs w:val="20"/>
+              </w:rPr>
+            </w:pPr>
+            <w:r>
+              <w:rPr>
+                <w:rFonts w:ascii="Calibri" w:eastAsia="Times New Roman" w:hAnsi="Calibri" w:cs="Calibri"/>
+                <w:color w:val="222222"/>
                 <w:sz w:val="20"/>
                 <w:szCs w:val="20"/>
               </w:rPr>
@@ -958,15 +958,15 @@
               <w:spacing w:before="180" w:after="180"/>
               <w:rPr>
                 <w:rFonts w:ascii="Calibri" w:eastAsia="Times New Roman" w:hAnsi="Calibri" w:cs="Calibri"/>
-                <w:color w:val="1C2333"/>
-                <w:sz w:val="20"/>
-                <w:szCs w:val="20"/>
-              </w:rPr>
-            </w:pPr>
-            <w:r>
-              <w:rPr>
-                <w:rFonts w:ascii="Calibri" w:eastAsia="Times New Roman" w:hAnsi="Calibri" w:cs="Calibri"/>
-                <w:color w:val="1C2333"/>
+                <w:color w:val="222222"/>
+                <w:sz w:val="20"/>
+                <w:szCs w:val="20"/>
+              </w:rPr>
+            </w:pPr>
+            <w:r>
+              <w:rPr>
+                <w:rFonts w:ascii="Calibri" w:eastAsia="Times New Roman" w:hAnsi="Calibri" w:cs="Calibri"/>
+                <w:color w:val="222222"/>
                 <w:sz w:val="20"/>
                 <w:szCs w:val="20"/>
               </w:rPr>
@@ -996,26 +996,26 @@
               <w:spacing w:before="180" w:after="180"/>
               <w:rPr>
                 <w:rFonts w:ascii="Calibri" w:eastAsia="Times New Roman" w:hAnsi="Calibri" w:cs="Calibri"/>
-                <w:color w:val="1C2333"/>
-                <w:sz w:val="20"/>
-                <w:szCs w:val="20"/>
-              </w:rPr>
-            </w:pPr>
-            <w:r>
-              <w:rPr>
-                <w:rFonts w:ascii="Calibri" w:eastAsia="Times New Roman" w:hAnsi="Calibri" w:cs="Calibri"/>
-                <w:color w:val="1C2333"/>
-                <w:sz w:val="20"/>
-                <w:szCs w:val="20"/>
-              </w:rPr>
-              <w:t xml:space="preserve">No storage buckets exist. CVs and photos are stored </w:t>
-            </w:r>
-            <w:r>
-              <w:rPr>
-                <w:rFonts w:ascii="Calibri" w:eastAsia="Times New Roman" w:hAnsi="Calibri" w:cs="Calibri"/>
-                <w:b/>
-                <w:bCs/>
-                <w:color w:val="1C2333"/>
+                <w:color w:val="222222"/>
+                <w:sz w:val="20"/>
+                <w:szCs w:val="20"/>
+              </w:rPr>
+            </w:pPr>
+            <w:r>
+              <w:rPr>
+                <w:rFonts w:ascii="Calibri" w:eastAsia="Times New Roman" w:hAnsi="Calibri" w:cs="Calibri"/>
+                <w:color w:val="222222"/>
+                <w:sz w:val="20"/>
+                <w:szCs w:val="20"/>
+              </w:rPr>
+              <w:t xml:space="preserve">No storage buckets exist. Résumés and photos are stored </w:t>
+            </w:r>
+            <w:r>
+              <w:rPr>
+                <w:rFonts w:ascii="Calibri" w:eastAsia="Times New Roman" w:hAnsi="Calibri" w:cs="Calibri"/>
+                <w:b/>
+                <w:bCs/>
+                <w:color w:val="222222"/>
                 <w:sz w:val="20"/>
                 <w:szCs w:val="20"/>
               </w:rPr>
@@ -1024,7 +1024,7 @@
             <w:r>
               <w:rPr>
                 <w:rFonts w:ascii="Calibri" w:eastAsia="Times New Roman" w:hAnsi="Calibri" w:cs="Calibri"/>
-                <w:color w:val="1C2333"/>
+                <w:color w:val="222222"/>
                 <w:sz w:val="20"/>
                 <w:szCs w:val="20"/>
               </w:rPr>
@@ -1057,17 +1057,17 @@
                 <w:rFonts w:ascii="Calibri" w:eastAsia="Times New Roman" w:hAnsi="Calibri" w:cs="Calibri"/>
                 <w:b/>
                 <w:bCs/>
-                <w:color w:val="1C2333"/>
-                <w:sz w:val="20"/>
-                <w:szCs w:val="20"/>
-              </w:rPr>
-            </w:pPr>
-            <w:r>
-              <w:rPr>
-                <w:rFonts w:ascii="Calibri" w:eastAsia="Times New Roman" w:hAnsi="Calibri" w:cs="Calibri"/>
-                <w:b/>
-                <w:bCs/>
-                <w:color w:val="1C2333"/>
+                <w:color w:val="222222"/>
+                <w:sz w:val="20"/>
+                <w:szCs w:val="20"/>
+              </w:rPr>
+            </w:pPr>
+            <w:r>
+              <w:rPr>
+                <w:rFonts w:ascii="Calibri" w:eastAsia="Times New Roman" w:hAnsi="Calibri" w:cs="Calibri"/>
+                <w:b/>
+                <w:bCs/>
+                <w:color w:val="222222"/>
                 <w:sz w:val="20"/>
                 <w:szCs w:val="20"/>
               </w:rPr>
@@ -1078,7 +1078,7 @@
       </w:tr>
       <w:tr>
         <w:trPr>
-          <w:divId w:val="1865942089"/>
+          <w:divId w:val="1891065320"/>
         </w:trPr>
         <w:tc>
           <w:tcPr>
@@ -1102,15 +1102,15 @@
               <w:spacing w:before="180" w:after="180"/>
               <w:rPr>
                 <w:rFonts w:ascii="Calibri" w:eastAsia="Times New Roman" w:hAnsi="Calibri" w:cs="Calibri"/>
-                <w:color w:val="1C2333"/>
-                <w:sz w:val="20"/>
-                <w:szCs w:val="20"/>
-              </w:rPr>
-            </w:pPr>
-            <w:r>
-              <w:rPr>
-                <w:rFonts w:ascii="Calibri" w:eastAsia="Times New Roman" w:hAnsi="Calibri" w:cs="Calibri"/>
-                <w:color w:val="1C2333"/>
+                <w:color w:val="222222"/>
+                <w:sz w:val="20"/>
+                <w:szCs w:val="20"/>
+              </w:rPr>
+            </w:pPr>
+            <w:r>
+              <w:rPr>
+                <w:rFonts w:ascii="Calibri" w:eastAsia="Times New Roman" w:hAnsi="Calibri" w:cs="Calibri"/>
+                <w:color w:val="222222"/>
                 <w:sz w:val="20"/>
                 <w:szCs w:val="20"/>
               </w:rPr>
@@ -1140,15 +1140,15 @@
               <w:spacing w:before="180" w:after="180"/>
               <w:rPr>
                 <w:rFonts w:ascii="Calibri" w:eastAsia="Times New Roman" w:hAnsi="Calibri" w:cs="Calibri"/>
-                <w:color w:val="1C2333"/>
-                <w:sz w:val="20"/>
-                <w:szCs w:val="20"/>
-              </w:rPr>
-            </w:pPr>
-            <w:r>
-              <w:rPr>
-                <w:rFonts w:ascii="Calibri" w:eastAsia="Times New Roman" w:hAnsi="Calibri" w:cs="Calibri"/>
-                <w:color w:val="1C2333"/>
+                <w:color w:val="222222"/>
+                <w:sz w:val="20"/>
+                <w:szCs w:val="20"/>
+              </w:rPr>
+            </w:pPr>
+            <w:r>
+              <w:rPr>
+                <w:rFonts w:ascii="Calibri" w:eastAsia="Times New Roman" w:hAnsi="Calibri" w:cs="Calibri"/>
+                <w:color w:val="222222"/>
                 <w:sz w:val="20"/>
                 <w:szCs w:val="20"/>
               </w:rPr>
@@ -1178,19 +1178,19 @@
               <w:spacing w:before="180" w:after="180"/>
               <w:rPr>
                 <w:rFonts w:ascii="Calibri" w:eastAsia="Times New Roman" w:hAnsi="Calibri" w:cs="Calibri"/>
-                <w:color w:val="1C2333"/>
-                <w:sz w:val="20"/>
-                <w:szCs w:val="20"/>
-              </w:rPr>
-            </w:pPr>
-            <w:r>
-              <w:rPr>
-                <w:rFonts w:ascii="Calibri" w:eastAsia="Times New Roman" w:hAnsi="Calibri" w:cs="Calibri"/>
-                <w:color w:val="1C2333"/>
-                <w:sz w:val="20"/>
-                <w:szCs w:val="20"/>
-              </w:rPr>
-              <w:t>Policies are hand-scoped and regression-tested by verify-rls.ts (23 assertions run against the live database as the app's own restricted role). The suite is rerun after every schema change.</w:t>
+                <w:color w:val="222222"/>
+                <w:sz w:val="20"/>
+                <w:szCs w:val="20"/>
+              </w:rPr>
+            </w:pPr>
+            <w:r>
+              <w:rPr>
+                <w:rFonts w:ascii="Calibri" w:eastAsia="Times New Roman" w:hAnsi="Calibri" w:cs="Calibri"/>
+                <w:color w:val="222222"/>
+                <w:sz w:val="20"/>
+                <w:szCs w:val="20"/>
+              </w:rPr>
+              <w:t>Policies are hand-scoped and regression-tested by a 23-assertion verification suite that runs against the live database as the app's own restricted role. The suite is rerun after every schema change.</w:t>
             </w:r>
           </w:p>
         </w:tc>
@@ -1219,17 +1219,17 @@
                 <w:rFonts w:ascii="Calibri" w:eastAsia="Times New Roman" w:hAnsi="Calibri" w:cs="Calibri"/>
                 <w:b/>
                 <w:bCs/>
-                <w:color w:val="1C2333"/>
-                <w:sz w:val="20"/>
-                <w:szCs w:val="20"/>
-              </w:rPr>
-            </w:pPr>
-            <w:r>
-              <w:rPr>
-                <w:rFonts w:ascii="Calibri" w:eastAsia="Times New Roman" w:hAnsi="Calibri" w:cs="Calibri"/>
-                <w:b/>
-                <w:bCs/>
-                <w:color w:val="1C2333"/>
+                <w:color w:val="222222"/>
+                <w:sz w:val="20"/>
+                <w:szCs w:val="20"/>
+              </w:rPr>
+            </w:pPr>
+            <w:r>
+              <w:rPr>
+                <w:rFonts w:ascii="Calibri" w:eastAsia="Times New Roman" w:hAnsi="Calibri" w:cs="Calibri"/>
+                <w:b/>
+                <w:bCs/>
+                <w:color w:val="222222"/>
                 <w:sz w:val="20"/>
                 <w:szCs w:val="20"/>
               </w:rPr>
@@ -1240,7 +1240,7 @@
       </w:tr>
       <w:tr>
         <w:trPr>
-          <w:divId w:val="1865942089"/>
+          <w:divId w:val="1891065320"/>
         </w:trPr>
         <w:tc>
           <w:tcPr>
@@ -1264,15 +1264,15 @@
               <w:spacing w:before="180" w:after="180"/>
               <w:rPr>
                 <w:rFonts w:ascii="Calibri" w:eastAsia="Times New Roman" w:hAnsi="Calibri" w:cs="Calibri"/>
-                <w:color w:val="1C2333"/>
-                <w:sz w:val="20"/>
-                <w:szCs w:val="20"/>
-              </w:rPr>
-            </w:pPr>
-            <w:r>
-              <w:rPr>
-                <w:rFonts w:ascii="Calibri" w:eastAsia="Times New Roman" w:hAnsi="Calibri" w:cs="Calibri"/>
-                <w:color w:val="1C2333"/>
+                <w:color w:val="222222"/>
+                <w:sz w:val="20"/>
+                <w:szCs w:val="20"/>
+              </w:rPr>
+            </w:pPr>
+            <w:r>
+              <w:rPr>
+                <w:rFonts w:ascii="Calibri" w:eastAsia="Times New Roman" w:hAnsi="Calibri" w:cs="Calibri"/>
+                <w:color w:val="222222"/>
                 <w:sz w:val="20"/>
                 <w:szCs w:val="20"/>
               </w:rPr>
@@ -1302,15 +1302,15 @@
               <w:spacing w:before="180" w:after="180"/>
               <w:rPr>
                 <w:rFonts w:ascii="Calibri" w:eastAsia="Times New Roman" w:hAnsi="Calibri" w:cs="Calibri"/>
-                <w:color w:val="1C2333"/>
-                <w:sz w:val="20"/>
-                <w:szCs w:val="20"/>
-              </w:rPr>
-            </w:pPr>
-            <w:r>
-              <w:rPr>
-                <w:rFonts w:ascii="Calibri" w:eastAsia="Times New Roman" w:hAnsi="Calibri" w:cs="Calibri"/>
-                <w:color w:val="1C2333"/>
+                <w:color w:val="222222"/>
+                <w:sz w:val="20"/>
+                <w:szCs w:val="20"/>
+              </w:rPr>
+            </w:pPr>
+            <w:r>
+              <w:rPr>
+                <w:rFonts w:ascii="Calibri" w:eastAsia="Times New Roman" w:hAnsi="Calibri" w:cs="Calibri"/>
+                <w:color w:val="222222"/>
                 <w:sz w:val="20"/>
                 <w:szCs w:val="20"/>
               </w:rPr>
@@ -1340,15 +1340,15 @@
               <w:spacing w:before="180" w:after="180"/>
               <w:rPr>
                 <w:rFonts w:ascii="Calibri" w:eastAsia="Times New Roman" w:hAnsi="Calibri" w:cs="Calibri"/>
-                <w:color w:val="1C2333"/>
-                <w:sz w:val="20"/>
-                <w:szCs w:val="20"/>
-              </w:rPr>
-            </w:pPr>
-            <w:r>
-              <w:rPr>
-                <w:rFonts w:ascii="Calibri" w:eastAsia="Times New Roman" w:hAnsi="Calibri" w:cs="Calibri"/>
-                <w:color w:val="1C2333"/>
+                <w:color w:val="222222"/>
+                <w:sz w:val="20"/>
+                <w:szCs w:val="20"/>
+              </w:rPr>
+            </w:pPr>
+            <w:r>
+              <w:rPr>
+                <w:rFonts w:ascii="Calibri" w:eastAsia="Times New Roman" w:hAnsi="Calibri" w:cs="Calibri"/>
+                <w:color w:val="222222"/>
                 <w:sz w:val="20"/>
                 <w:szCs w:val="20"/>
               </w:rPr>
@@ -1381,17 +1381,17 @@
                 <w:rFonts w:ascii="Calibri" w:eastAsia="Times New Roman" w:hAnsi="Calibri" w:cs="Calibri"/>
                 <w:b/>
                 <w:bCs/>
-                <w:color w:val="1C2333"/>
-                <w:sz w:val="20"/>
-                <w:szCs w:val="20"/>
-              </w:rPr>
-            </w:pPr>
-            <w:r>
-              <w:rPr>
-                <w:rFonts w:ascii="Calibri" w:eastAsia="Times New Roman" w:hAnsi="Calibri" w:cs="Calibri"/>
-                <w:b/>
-                <w:bCs/>
-                <w:color w:val="1C2333"/>
+                <w:color w:val="222222"/>
+                <w:sz w:val="20"/>
+                <w:szCs w:val="20"/>
+              </w:rPr>
+            </w:pPr>
+            <w:r>
+              <w:rPr>
+                <w:rFonts w:ascii="Calibri" w:eastAsia="Times New Roman" w:hAnsi="Calibri" w:cs="Calibri"/>
+                <w:b/>
+                <w:bCs/>
+                <w:color w:val="222222"/>
                 <w:sz w:val="20"/>
                 <w:szCs w:val="20"/>
               </w:rPr>
@@ -1404,7 +1404,7 @@
     <w:p>
       <w:pPr>
         <w:pStyle w:val="Heading2"/>
-        <w:divId w:val="1865942089"/>
+        <w:divId w:val="1891065320"/>
         <w:rPr>
           <w:rFonts w:ascii="Calibri" w:eastAsia="Times New Roman" w:hAnsi="Calibri" w:cs="Calibri"/>
         </w:rPr>
@@ -1429,18 +1429,18 @@
       </w:tblPr>
       <w:tblGrid>
         <w:gridCol w:w="342"/>
-        <w:gridCol w:w="3287"/>
-        <w:gridCol w:w="3568"/>
+        <w:gridCol w:w="3341"/>
+        <w:gridCol w:w="3514"/>
         <w:gridCol w:w="2163"/>
       </w:tblGrid>
       <w:tr>
         <w:trPr>
-          <w:divId w:val="1865942089"/>
+          <w:divId w:val="1891065320"/>
         </w:trPr>
         <w:tc>
           <w:tcPr>
             <w:tcW w:w="0" w:type="auto"/>
-            <w:shd w:val="clear" w:color="auto" w:fill="0A1128"/>
+            <w:shd w:val="clear" w:color="auto" w:fill="1F3352"/>
             <w:tcMar>
               <w:top w:w="90" w:type="dxa"/>
               <w:left w:w="120" w:type="dxa"/>
@@ -1457,17 +1457,17 @@
                 <w:rFonts w:ascii="Calibri" w:eastAsia="Times New Roman" w:hAnsi="Calibri" w:cs="Calibri"/>
                 <w:b/>
                 <w:bCs/>
-                <w:color w:val="E8CC6E"/>
-                <w:sz w:val="20"/>
-                <w:szCs w:val="20"/>
-              </w:rPr>
-            </w:pPr>
-            <w:r>
-              <w:rPr>
-                <w:rFonts w:ascii="Calibri" w:eastAsia="Times New Roman" w:hAnsi="Calibri" w:cs="Calibri"/>
-                <w:b/>
-                <w:bCs/>
-                <w:color w:val="E8CC6E"/>
+                <w:color w:val="FFFFFF"/>
+                <w:sz w:val="20"/>
+                <w:szCs w:val="20"/>
+              </w:rPr>
+            </w:pPr>
+            <w:r>
+              <w:rPr>
+                <w:rFonts w:ascii="Calibri" w:eastAsia="Times New Roman" w:hAnsi="Calibri" w:cs="Calibri"/>
+                <w:b/>
+                <w:bCs/>
+                <w:color w:val="FFFFFF"/>
                 <w:sz w:val="20"/>
                 <w:szCs w:val="20"/>
               </w:rPr>
@@ -1478,7 +1478,7 @@
         <w:tc>
           <w:tcPr>
             <w:tcW w:w="0" w:type="auto"/>
-            <w:shd w:val="clear" w:color="auto" w:fill="0A1128"/>
+            <w:shd w:val="clear" w:color="auto" w:fill="1F3352"/>
             <w:tcMar>
               <w:top w:w="90" w:type="dxa"/>
               <w:left w:w="120" w:type="dxa"/>
@@ -1495,17 +1495,17 @@
                 <w:rFonts w:ascii="Calibri" w:eastAsia="Times New Roman" w:hAnsi="Calibri" w:cs="Calibri"/>
                 <w:b/>
                 <w:bCs/>
-                <w:color w:val="E8CC6E"/>
-                <w:sz w:val="20"/>
-                <w:szCs w:val="20"/>
-              </w:rPr>
-            </w:pPr>
-            <w:r>
-              <w:rPr>
-                <w:rFonts w:ascii="Calibri" w:eastAsia="Times New Roman" w:hAnsi="Calibri" w:cs="Calibri"/>
-                <w:b/>
-                <w:bCs/>
-                <w:color w:val="E8CC6E"/>
+                <w:color w:val="FFFFFF"/>
+                <w:sz w:val="20"/>
+                <w:szCs w:val="20"/>
+              </w:rPr>
+            </w:pPr>
+            <w:r>
+              <w:rPr>
+                <w:rFonts w:ascii="Calibri" w:eastAsia="Times New Roman" w:hAnsi="Calibri" w:cs="Calibri"/>
+                <w:b/>
+                <w:bCs/>
+                <w:color w:val="FFFFFF"/>
                 <w:sz w:val="20"/>
                 <w:szCs w:val="20"/>
               </w:rPr>
@@ -1516,7 +1516,7 @@
         <w:tc>
           <w:tcPr>
             <w:tcW w:w="0" w:type="auto"/>
-            <w:shd w:val="clear" w:color="auto" w:fill="0A1128"/>
+            <w:shd w:val="clear" w:color="auto" w:fill="1F3352"/>
             <w:tcMar>
               <w:top w:w="90" w:type="dxa"/>
               <w:left w:w="120" w:type="dxa"/>
@@ -1533,28 +1533,28 @@
                 <w:rFonts w:ascii="Calibri" w:eastAsia="Times New Roman" w:hAnsi="Calibri" w:cs="Calibri"/>
                 <w:b/>
                 <w:bCs/>
-                <w:color w:val="E8CC6E"/>
-                <w:sz w:val="20"/>
-                <w:szCs w:val="20"/>
-              </w:rPr>
-            </w:pPr>
-            <w:r>
-              <w:rPr>
-                <w:rFonts w:ascii="Calibri" w:eastAsia="Times New Roman" w:hAnsi="Calibri" w:cs="Calibri"/>
-                <w:b/>
-                <w:bCs/>
-                <w:color w:val="E8CC6E"/>
-                <w:sz w:val="20"/>
-                <w:szCs w:val="20"/>
-              </w:rPr>
-              <w:t>Eisavant response</w:t>
-            </w:r>
-          </w:p>
-        </w:tc>
-        <w:tc>
-          <w:tcPr>
-            <w:tcW w:w="0" w:type="auto"/>
-            <w:shd w:val="clear" w:color="auto" w:fill="0A1128"/>
+                <w:color w:val="FFFFFF"/>
+                <w:sz w:val="20"/>
+                <w:szCs w:val="20"/>
+              </w:rPr>
+            </w:pPr>
+            <w:r>
+              <w:rPr>
+                <w:rFonts w:ascii="Calibri" w:eastAsia="Times New Roman" w:hAnsi="Calibri" w:cs="Calibri"/>
+                <w:b/>
+                <w:bCs/>
+                <w:color w:val="FFFFFF"/>
+                <w:sz w:val="20"/>
+                <w:szCs w:val="20"/>
+              </w:rPr>
+              <w:t>Response</w:t>
+            </w:r>
+          </w:p>
+        </w:tc>
+        <w:tc>
+          <w:tcPr>
+            <w:tcW w:w="0" w:type="auto"/>
+            <w:shd w:val="clear" w:color="auto" w:fill="1F3352"/>
             <w:tcMar>
               <w:top w:w="90" w:type="dxa"/>
               <w:left w:w="120" w:type="dxa"/>
@@ -1571,17 +1571,17 @@
                 <w:rFonts w:ascii="Calibri" w:eastAsia="Times New Roman" w:hAnsi="Calibri" w:cs="Calibri"/>
                 <w:b/>
                 <w:bCs/>
-                <w:color w:val="E8CC6E"/>
-                <w:sz w:val="20"/>
-                <w:szCs w:val="20"/>
-              </w:rPr>
-            </w:pPr>
-            <w:r>
-              <w:rPr>
-                <w:rFonts w:ascii="Calibri" w:eastAsia="Times New Roman" w:hAnsi="Calibri" w:cs="Calibri"/>
-                <w:b/>
-                <w:bCs/>
-                <w:color w:val="E8CC6E"/>
+                <w:color w:val="FFFFFF"/>
+                <w:sz w:val="20"/>
+                <w:szCs w:val="20"/>
+              </w:rPr>
+            </w:pPr>
+            <w:r>
+              <w:rPr>
+                <w:rFonts w:ascii="Calibri" w:eastAsia="Times New Roman" w:hAnsi="Calibri" w:cs="Calibri"/>
+                <w:b/>
+                <w:bCs/>
+                <w:color w:val="FFFFFF"/>
                 <w:sz w:val="20"/>
                 <w:szCs w:val="20"/>
               </w:rPr>
@@ -1592,7 +1592,7 @@
       </w:tr>
       <w:tr>
         <w:trPr>
-          <w:divId w:val="1865942089"/>
+          <w:divId w:val="1891065320"/>
         </w:trPr>
         <w:tc>
           <w:tcPr>
@@ -1616,15 +1616,15 @@
               <w:spacing w:before="180" w:after="180"/>
               <w:rPr>
                 <w:rFonts w:ascii="Calibri" w:eastAsia="Times New Roman" w:hAnsi="Calibri" w:cs="Calibri"/>
-                <w:color w:val="1C2333"/>
-                <w:sz w:val="20"/>
-                <w:szCs w:val="20"/>
-              </w:rPr>
-            </w:pPr>
-            <w:r>
-              <w:rPr>
-                <w:rFonts w:ascii="Calibri" w:eastAsia="Times New Roman" w:hAnsi="Calibri" w:cs="Calibri"/>
-                <w:color w:val="1C2333"/>
+                <w:color w:val="222222"/>
+                <w:sz w:val="20"/>
+                <w:szCs w:val="20"/>
+              </w:rPr>
+            </w:pPr>
+            <w:r>
+              <w:rPr>
+                <w:rFonts w:ascii="Calibri" w:eastAsia="Times New Roman" w:hAnsi="Calibri" w:cs="Calibri"/>
+                <w:color w:val="222222"/>
                 <w:sz w:val="20"/>
                 <w:szCs w:val="20"/>
               </w:rPr>
@@ -1654,15 +1654,15 @@
               <w:spacing w:before="180" w:after="180"/>
               <w:rPr>
                 <w:rFonts w:ascii="Calibri" w:eastAsia="Times New Roman" w:hAnsi="Calibri" w:cs="Calibri"/>
-                <w:color w:val="1C2333"/>
-                <w:sz w:val="20"/>
-                <w:szCs w:val="20"/>
-              </w:rPr>
-            </w:pPr>
-            <w:r>
-              <w:rPr>
-                <w:rFonts w:ascii="Calibri" w:eastAsia="Times New Roman" w:hAnsi="Calibri" w:cs="Calibri"/>
-                <w:color w:val="1C2333"/>
+                <w:color w:val="222222"/>
+                <w:sz w:val="20"/>
+                <w:szCs w:val="20"/>
+              </w:rPr>
+            </w:pPr>
+            <w:r>
+              <w:rPr>
+                <w:rFonts w:ascii="Calibri" w:eastAsia="Times New Roman" w:hAnsi="Calibri" w:cs="Calibri"/>
+                <w:color w:val="222222"/>
                 <w:sz w:val="20"/>
                 <w:szCs w:val="20"/>
               </w:rPr>
@@ -1692,19 +1692,19 @@
               <w:spacing w:before="180" w:after="180"/>
               <w:rPr>
                 <w:rFonts w:ascii="Calibri" w:eastAsia="Times New Roman" w:hAnsi="Calibri" w:cs="Calibri"/>
-                <w:color w:val="1C2333"/>
-                <w:sz w:val="20"/>
-                <w:szCs w:val="20"/>
-              </w:rPr>
-            </w:pPr>
-            <w:r>
-              <w:rPr>
-                <w:rFonts w:ascii="Calibri" w:eastAsia="Times New Roman" w:hAnsi="Calibri" w:cs="Calibri"/>
-                <w:color w:val="1C2333"/>
-                <w:sz w:val="20"/>
-                <w:szCs w:val="20"/>
-              </w:rPr>
-              <w:t>Done, including the junction table (position_candidates) and every table added since. FORCE is set so even the table-owner path cannot bypass it. New tables are private until a policy grants access.</w:t>
+                <w:color w:val="222222"/>
+                <w:sz w:val="20"/>
+                <w:szCs w:val="20"/>
+              </w:rPr>
+            </w:pPr>
+            <w:r>
+              <w:rPr>
+                <w:rFonts w:ascii="Calibri" w:eastAsia="Times New Roman" w:hAnsi="Calibri" w:cs="Calibri"/>
+                <w:color w:val="222222"/>
+                <w:sz w:val="20"/>
+                <w:szCs w:val="20"/>
+              </w:rPr>
+              <w:t>Done, including junction tables. FORCE is set so even the table-owner path cannot bypass it. New tables are private until a policy grants access.</w:t>
             </w:r>
           </w:p>
         </w:tc>
@@ -1733,17 +1733,17 @@
                 <w:rFonts w:ascii="Calibri" w:eastAsia="Times New Roman" w:hAnsi="Calibri" w:cs="Calibri"/>
                 <w:b/>
                 <w:bCs/>
-                <w:color w:val="1C2333"/>
-                <w:sz w:val="20"/>
-                <w:szCs w:val="20"/>
-              </w:rPr>
-            </w:pPr>
-            <w:r>
-              <w:rPr>
-                <w:rFonts w:ascii="Calibri" w:eastAsia="Times New Roman" w:hAnsi="Calibri" w:cs="Calibri"/>
-                <w:b/>
-                <w:bCs/>
-                <w:color w:val="1C2333"/>
+                <w:color w:val="222222"/>
+                <w:sz w:val="20"/>
+                <w:szCs w:val="20"/>
+              </w:rPr>
+            </w:pPr>
+            <w:r>
+              <w:rPr>
+                <w:rFonts w:ascii="Calibri" w:eastAsia="Times New Roman" w:hAnsi="Calibri" w:cs="Calibri"/>
+                <w:b/>
+                <w:bCs/>
+                <w:color w:val="222222"/>
                 <w:sz w:val="20"/>
                 <w:szCs w:val="20"/>
               </w:rPr>
@@ -1754,7 +1754,7 @@
       </w:tr>
       <w:tr>
         <w:trPr>
-          <w:divId w:val="1865942089"/>
+          <w:divId w:val="1891065320"/>
         </w:trPr>
         <w:tc>
           <w:tcPr>
@@ -1778,15 +1778,15 @@
               <w:spacing w:before="180" w:after="180"/>
               <w:rPr>
                 <w:rFonts w:ascii="Calibri" w:eastAsia="Times New Roman" w:hAnsi="Calibri" w:cs="Calibri"/>
-                <w:color w:val="1C2333"/>
-                <w:sz w:val="20"/>
-                <w:szCs w:val="20"/>
-              </w:rPr>
-            </w:pPr>
-            <w:r>
-              <w:rPr>
-                <w:rFonts w:ascii="Calibri" w:eastAsia="Times New Roman" w:hAnsi="Calibri" w:cs="Calibri"/>
-                <w:color w:val="1C2333"/>
+                <w:color w:val="222222"/>
+                <w:sz w:val="20"/>
+                <w:szCs w:val="20"/>
+              </w:rPr>
+            </w:pPr>
+            <w:r>
+              <w:rPr>
+                <w:rFonts w:ascii="Calibri" w:eastAsia="Times New Roman" w:hAnsi="Calibri" w:cs="Calibri"/>
+                <w:color w:val="222222"/>
                 <w:sz w:val="20"/>
                 <w:szCs w:val="20"/>
               </w:rPr>
@@ -1816,15 +1816,15 @@
               <w:spacing w:before="180" w:after="180"/>
               <w:rPr>
                 <w:rFonts w:ascii="Calibri" w:eastAsia="Times New Roman" w:hAnsi="Calibri" w:cs="Calibri"/>
-                <w:color w:val="1C2333"/>
-                <w:sz w:val="20"/>
-                <w:szCs w:val="20"/>
-              </w:rPr>
-            </w:pPr>
-            <w:r>
-              <w:rPr>
-                <w:rFonts w:ascii="Calibri" w:eastAsia="Times New Roman" w:hAnsi="Calibri" w:cs="Calibri"/>
-                <w:color w:val="1C2333"/>
+                <w:color w:val="222222"/>
+                <w:sz w:val="20"/>
+                <w:szCs w:val="20"/>
+              </w:rPr>
+            </w:pPr>
+            <w:r>
+              <w:rPr>
+                <w:rFonts w:ascii="Calibri" w:eastAsia="Times New Roman" w:hAnsi="Calibri" w:cs="Calibri"/>
+                <w:color w:val="222222"/>
                 <w:sz w:val="20"/>
                 <w:szCs w:val="20"/>
               </w:rPr>
@@ -1854,19 +1854,19 @@
               <w:spacing w:before="180" w:after="180"/>
               <w:rPr>
                 <w:rFonts w:ascii="Calibri" w:eastAsia="Times New Roman" w:hAnsi="Calibri" w:cs="Calibri"/>
-                <w:color w:val="1C2333"/>
-                <w:sz w:val="20"/>
-                <w:szCs w:val="20"/>
-              </w:rPr>
-            </w:pPr>
-            <w:r>
-              <w:rPr>
-                <w:rFonts w:ascii="Calibri" w:eastAsia="Times New Roman" w:hAnsi="Calibri" w:cs="Calibri"/>
-                <w:color w:val="1C2333"/>
-                <w:sz w:val="20"/>
-                <w:szCs w:val="20"/>
-              </w:rPr>
-              <w:t>This is exactly what the verification suite does: it exercises the database as an anonymous caller, as two different members, as support, as a client company, and as admin — and asserts each sees only what they should.</w:t>
+                <w:color w:val="222222"/>
+                <w:sz w:val="20"/>
+                <w:szCs w:val="20"/>
+              </w:rPr>
+            </w:pPr>
+            <w:r>
+              <w:rPr>
+                <w:rFonts w:ascii="Calibri" w:eastAsia="Times New Roman" w:hAnsi="Calibri" w:cs="Calibri"/>
+                <w:color w:val="222222"/>
+                <w:sz w:val="20"/>
+                <w:szCs w:val="20"/>
+              </w:rPr>
+              <w:t>This is exactly what the verification suite does: it exercises the database as an anonymous caller, as two different members, as support staff, as a client company, and as admin — and asserts each sees only what they should.</w:t>
             </w:r>
           </w:p>
         </w:tc>
@@ -1895,17 +1895,17 @@
                 <w:rFonts w:ascii="Calibri" w:eastAsia="Times New Roman" w:hAnsi="Calibri" w:cs="Calibri"/>
                 <w:b/>
                 <w:bCs/>
-                <w:color w:val="1C2333"/>
-                <w:sz w:val="20"/>
-                <w:szCs w:val="20"/>
-              </w:rPr>
-            </w:pPr>
-            <w:r>
-              <w:rPr>
-                <w:rFonts w:ascii="Calibri" w:eastAsia="Times New Roman" w:hAnsi="Calibri" w:cs="Calibri"/>
-                <w:b/>
-                <w:bCs/>
-                <w:color w:val="1C2333"/>
+                <w:color w:val="222222"/>
+                <w:sz w:val="20"/>
+                <w:szCs w:val="20"/>
+              </w:rPr>
+            </w:pPr>
+            <w:r>
+              <w:rPr>
+                <w:rFonts w:ascii="Calibri" w:eastAsia="Times New Roman" w:hAnsi="Calibri" w:cs="Calibri"/>
+                <w:b/>
+                <w:bCs/>
+                <w:color w:val="222222"/>
                 <w:sz w:val="20"/>
                 <w:szCs w:val="20"/>
               </w:rPr>
@@ -1916,7 +1916,7 @@
       </w:tr>
       <w:tr>
         <w:trPr>
-          <w:divId w:val="1865942089"/>
+          <w:divId w:val="1891065320"/>
         </w:trPr>
         <w:tc>
           <w:tcPr>
@@ -1940,15 +1940,15 @@
               <w:spacing w:before="180" w:after="180"/>
               <w:rPr>
                 <w:rFonts w:ascii="Calibri" w:eastAsia="Times New Roman" w:hAnsi="Calibri" w:cs="Calibri"/>
-                <w:color w:val="1C2333"/>
-                <w:sz w:val="20"/>
-                <w:szCs w:val="20"/>
-              </w:rPr>
-            </w:pPr>
-            <w:r>
-              <w:rPr>
-                <w:rFonts w:ascii="Calibri" w:eastAsia="Times New Roman" w:hAnsi="Calibri" w:cs="Calibri"/>
-                <w:color w:val="1C2333"/>
+                <w:color w:val="222222"/>
+                <w:sz w:val="20"/>
+                <w:szCs w:val="20"/>
+              </w:rPr>
+            </w:pPr>
+            <w:r>
+              <w:rPr>
+                <w:rFonts w:ascii="Calibri" w:eastAsia="Times New Roman" w:hAnsi="Calibri" w:cs="Calibri"/>
+                <w:color w:val="222222"/>
                 <w:sz w:val="20"/>
                 <w:szCs w:val="20"/>
               </w:rPr>
@@ -1978,15 +1978,15 @@
               <w:spacing w:before="180" w:after="180"/>
               <w:rPr>
                 <w:rFonts w:ascii="Calibri" w:eastAsia="Times New Roman" w:hAnsi="Calibri" w:cs="Calibri"/>
-                <w:color w:val="1C2333"/>
-                <w:sz w:val="20"/>
-                <w:szCs w:val="20"/>
-              </w:rPr>
-            </w:pPr>
-            <w:r>
-              <w:rPr>
-                <w:rFonts w:ascii="Calibri" w:eastAsia="Times New Roman" w:hAnsi="Calibri" w:cs="Calibri"/>
-                <w:color w:val="1C2333"/>
+                <w:color w:val="222222"/>
+                <w:sz w:val="20"/>
+                <w:szCs w:val="20"/>
+              </w:rPr>
+            </w:pPr>
+            <w:r>
+              <w:rPr>
+                <w:rFonts w:ascii="Calibri" w:eastAsia="Times New Roman" w:hAnsi="Calibri" w:cs="Calibri"/>
+                <w:color w:val="222222"/>
                 <w:sz w:val="20"/>
                 <w:szCs w:val="20"/>
               </w:rPr>
@@ -2016,19 +2016,19 @@
               <w:spacing w:before="180" w:after="180"/>
               <w:rPr>
                 <w:rFonts w:ascii="Calibri" w:eastAsia="Times New Roman" w:hAnsi="Calibri" w:cs="Calibri"/>
-                <w:color w:val="1C2333"/>
-                <w:sz w:val="20"/>
-                <w:szCs w:val="20"/>
-              </w:rPr>
-            </w:pPr>
-            <w:r>
-              <w:rPr>
-                <w:rFonts w:ascii="Calibri" w:eastAsia="Times New Roman" w:hAnsi="Calibri" w:cs="Calibri"/>
-                <w:color w:val="1C2333"/>
-                <w:sz w:val="20"/>
-                <w:szCs w:val="20"/>
-              </w:rPr>
-              <w:t>Asserted directly: a member sees only their own user row, cannot read or update another member's profile, and cannot read staff notes. Cross-user updates affect 0 rows.</w:t>
+                <w:color w:val="222222"/>
+                <w:sz w:val="20"/>
+                <w:szCs w:val="20"/>
+              </w:rPr>
+            </w:pPr>
+            <w:r>
+              <w:rPr>
+                <w:rFonts w:ascii="Calibri" w:eastAsia="Times New Roman" w:hAnsi="Calibri" w:cs="Calibri"/>
+                <w:color w:val="222222"/>
+                <w:sz w:val="20"/>
+                <w:szCs w:val="20"/>
+              </w:rPr>
+              <w:t>Asserted directly: a member sees only their own account row, cannot read or update another member's profile, and cannot read staff notes. Cross-user updates affect 0 rows.</w:t>
             </w:r>
           </w:p>
         </w:tc>
@@ -2057,17 +2057,17 @@
                 <w:rFonts w:ascii="Calibri" w:eastAsia="Times New Roman" w:hAnsi="Calibri" w:cs="Calibri"/>
                 <w:b/>
                 <w:bCs/>
-                <w:color w:val="1C2333"/>
-                <w:sz w:val="20"/>
-                <w:szCs w:val="20"/>
-              </w:rPr>
-            </w:pPr>
-            <w:r>
-              <w:rPr>
-                <w:rFonts w:ascii="Calibri" w:eastAsia="Times New Roman" w:hAnsi="Calibri" w:cs="Calibri"/>
-                <w:b/>
-                <w:bCs/>
-                <w:color w:val="1C2333"/>
+                <w:color w:val="222222"/>
+                <w:sz w:val="20"/>
+                <w:szCs w:val="20"/>
+              </w:rPr>
+            </w:pPr>
+            <w:r>
+              <w:rPr>
+                <w:rFonts w:ascii="Calibri" w:eastAsia="Times New Roman" w:hAnsi="Calibri" w:cs="Calibri"/>
+                <w:b/>
+                <w:bCs/>
+                <w:color w:val="222222"/>
                 <w:sz w:val="20"/>
                 <w:szCs w:val="20"/>
               </w:rPr>
@@ -2078,7 +2078,7 @@
       </w:tr>
       <w:tr>
         <w:trPr>
-          <w:divId w:val="1865942089"/>
+          <w:divId w:val="1891065320"/>
         </w:trPr>
         <w:tc>
           <w:tcPr>
@@ -2102,15 +2102,15 @@
               <w:spacing w:before="180" w:after="180"/>
               <w:rPr>
                 <w:rFonts w:ascii="Calibri" w:eastAsia="Times New Roman" w:hAnsi="Calibri" w:cs="Calibri"/>
-                <w:color w:val="1C2333"/>
-                <w:sz w:val="20"/>
-                <w:szCs w:val="20"/>
-              </w:rPr>
-            </w:pPr>
-            <w:r>
-              <w:rPr>
-                <w:rFonts w:ascii="Calibri" w:eastAsia="Times New Roman" w:hAnsi="Calibri" w:cs="Calibri"/>
-                <w:color w:val="1C2333"/>
+                <w:color w:val="222222"/>
+                <w:sz w:val="20"/>
+                <w:szCs w:val="20"/>
+              </w:rPr>
+            </w:pPr>
+            <w:r>
+              <w:rPr>
+                <w:rFonts w:ascii="Calibri" w:eastAsia="Times New Roman" w:hAnsi="Calibri" w:cs="Calibri"/>
+                <w:color w:val="222222"/>
                 <w:sz w:val="20"/>
                 <w:szCs w:val="20"/>
               </w:rPr>
@@ -2140,15 +2140,15 @@
               <w:spacing w:before="180" w:after="180"/>
               <w:rPr>
                 <w:rFonts w:ascii="Calibri" w:eastAsia="Times New Roman" w:hAnsi="Calibri" w:cs="Calibri"/>
-                <w:color w:val="1C2333"/>
-                <w:sz w:val="20"/>
-                <w:szCs w:val="20"/>
-              </w:rPr>
-            </w:pPr>
-            <w:r>
-              <w:rPr>
-                <w:rFonts w:ascii="Calibri" w:eastAsia="Times New Roman" w:hAnsi="Calibri" w:cs="Calibri"/>
-                <w:color w:val="1C2333"/>
+                <w:color w:val="222222"/>
+                <w:sz w:val="20"/>
+                <w:szCs w:val="20"/>
+              </w:rPr>
+            </w:pPr>
+            <w:r>
+              <w:rPr>
+                <w:rFonts w:ascii="Calibri" w:eastAsia="Times New Roman" w:hAnsi="Calibri" w:cs="Calibri"/>
+                <w:color w:val="222222"/>
                 <w:sz w:val="20"/>
                 <w:szCs w:val="20"/>
               </w:rPr>
@@ -2178,29 +2178,29 @@
               <w:spacing w:before="180" w:after="180"/>
               <w:rPr>
                 <w:rFonts w:ascii="Calibri" w:eastAsia="Times New Roman" w:hAnsi="Calibri" w:cs="Calibri"/>
-                <w:color w:val="1C2333"/>
-                <w:sz w:val="20"/>
-                <w:szCs w:val="20"/>
-              </w:rPr>
-            </w:pPr>
-            <w:r>
-              <w:rPr>
-                <w:rFonts w:ascii="Calibri" w:eastAsia="Times New Roman" w:hAnsi="Calibri" w:cs="Calibri"/>
-                <w:color w:val="1C2333"/>
-                <w:sz w:val="20"/>
-                <w:szCs w:val="20"/>
-              </w:rPr>
-              <w:t xml:space="preserve">No such keys exist in this stack. The repo contains no credentials: .env is gitignored, .env.example ships </w:t>
-            </w:r>
-            <w:r>
-              <w:rPr>
-                <w:rFonts w:ascii="Calibri" w:eastAsia="Times New Roman" w:hAnsi="Calibri" w:cs="Calibri"/>
-                <w:color w:val="1C2333"/>
+                <w:color w:val="222222"/>
+                <w:sz w:val="20"/>
+                <w:szCs w:val="20"/>
+              </w:rPr>
+            </w:pPr>
+            <w:r>
+              <w:rPr>
+                <w:rFonts w:ascii="Calibri" w:eastAsia="Times New Roman" w:hAnsi="Calibri" w:cs="Calibri"/>
+                <w:color w:val="222222"/>
+                <w:sz w:val="20"/>
+                <w:szCs w:val="20"/>
+              </w:rPr>
+              <w:t xml:space="preserve">No such keys exist in this stack. The repository contains no credentials: the environment file is git-ignored, the checked-in example ships placeholders </w:t>
+            </w:r>
+            <w:r>
+              <w:rPr>
+                <w:rFonts w:ascii="Calibri" w:eastAsia="Times New Roman" w:hAnsi="Calibri" w:cs="Calibri"/>
+                <w:color w:val="222222"/>
                 <w:sz w:val="20"/>
                 <w:szCs w:val="20"/>
               </w:rPr>
               <w:lastRenderedPageBreak/>
-              <w:t>placeholders only, and production secrets live in Railway service variables. Re-scan on every review.</w:t>
+              <w:t>only, and production secrets live in the hosting platform's service variables. Re-scan on every review.</w:t>
             </w:r>
           </w:p>
         </w:tc>
@@ -2229,17 +2229,17 @@
                 <w:rFonts w:ascii="Calibri" w:eastAsia="Times New Roman" w:hAnsi="Calibri" w:cs="Calibri"/>
                 <w:b/>
                 <w:bCs/>
-                <w:color w:val="1C2333"/>
-                <w:sz w:val="20"/>
-                <w:szCs w:val="20"/>
-              </w:rPr>
-            </w:pPr>
-            <w:r>
-              <w:rPr>
-                <w:rFonts w:ascii="Calibri" w:eastAsia="Times New Roman" w:hAnsi="Calibri" w:cs="Calibri"/>
-                <w:b/>
-                <w:bCs/>
-                <w:color w:val="1C2333"/>
+                <w:color w:val="222222"/>
+                <w:sz w:val="20"/>
+                <w:szCs w:val="20"/>
+              </w:rPr>
+            </w:pPr>
+            <w:r>
+              <w:rPr>
+                <w:rFonts w:ascii="Calibri" w:eastAsia="Times New Roman" w:hAnsi="Calibri" w:cs="Calibri"/>
+                <w:b/>
+                <w:bCs/>
+                <w:color w:val="222222"/>
                 <w:sz w:val="20"/>
                 <w:szCs w:val="20"/>
               </w:rPr>
@@ -2251,7 +2251,7 @@
       </w:tr>
       <w:tr>
         <w:trPr>
-          <w:divId w:val="1865942089"/>
+          <w:divId w:val="1891065320"/>
         </w:trPr>
         <w:tc>
           <w:tcPr>
@@ -2275,15 +2275,15 @@
               <w:spacing w:before="180" w:after="180"/>
               <w:rPr>
                 <w:rFonts w:ascii="Calibri" w:eastAsia="Times New Roman" w:hAnsi="Calibri" w:cs="Calibri"/>
-                <w:color w:val="1C2333"/>
-                <w:sz w:val="20"/>
-                <w:szCs w:val="20"/>
-              </w:rPr>
-            </w:pPr>
-            <w:r>
-              <w:rPr>
-                <w:rFonts w:ascii="Calibri" w:eastAsia="Times New Roman" w:hAnsi="Calibri" w:cs="Calibri"/>
-                <w:color w:val="1C2333"/>
+                <w:color w:val="222222"/>
+                <w:sz w:val="20"/>
+                <w:szCs w:val="20"/>
+              </w:rPr>
+            </w:pPr>
+            <w:r>
+              <w:rPr>
+                <w:rFonts w:ascii="Calibri" w:eastAsia="Times New Roman" w:hAnsi="Calibri" w:cs="Calibri"/>
+                <w:color w:val="222222"/>
                 <w:sz w:val="20"/>
                 <w:szCs w:val="20"/>
               </w:rPr>
@@ -2313,15 +2313,15 @@
               <w:spacing w:before="180" w:after="180"/>
               <w:rPr>
                 <w:rFonts w:ascii="Calibri" w:eastAsia="Times New Roman" w:hAnsi="Calibri" w:cs="Calibri"/>
-                <w:color w:val="1C2333"/>
-                <w:sz w:val="20"/>
-                <w:szCs w:val="20"/>
-              </w:rPr>
-            </w:pPr>
-            <w:r>
-              <w:rPr>
-                <w:rFonts w:ascii="Calibri" w:eastAsia="Times New Roman" w:hAnsi="Calibri" w:cs="Calibri"/>
-                <w:color w:val="1C2333"/>
+                <w:color w:val="222222"/>
+                <w:sz w:val="20"/>
+                <w:szCs w:val="20"/>
+              </w:rPr>
+            </w:pPr>
+            <w:r>
+              <w:rPr>
+                <w:rFonts w:ascii="Calibri" w:eastAsia="Times New Roman" w:hAnsi="Calibri" w:cs="Calibri"/>
+                <w:color w:val="222222"/>
                 <w:sz w:val="20"/>
                 <w:szCs w:val="20"/>
               </w:rPr>
@@ -2351,19 +2351,19 @@
               <w:spacing w:before="180" w:after="180"/>
               <w:rPr>
                 <w:rFonts w:ascii="Calibri" w:eastAsia="Times New Roman" w:hAnsi="Calibri" w:cs="Calibri"/>
-                <w:color w:val="1C2333"/>
-                <w:sz w:val="20"/>
-                <w:szCs w:val="20"/>
-              </w:rPr>
-            </w:pPr>
-            <w:r>
-              <w:rPr>
-                <w:rFonts w:ascii="Calibri" w:eastAsia="Times New Roman" w:hAnsi="Calibri" w:cs="Calibri"/>
-                <w:color w:val="1C2333"/>
-                <w:sz w:val="20"/>
-                <w:szCs w:val="20"/>
-              </w:rPr>
-              <w:t>All privileged code is in the Express API (the equivalent of Edge Functions in this architecture). The frontend only calls /api/* with a session cookie.</w:t>
+                <w:color w:val="222222"/>
+                <w:sz w:val="20"/>
+                <w:szCs w:val="20"/>
+              </w:rPr>
+            </w:pPr>
+            <w:r>
+              <w:rPr>
+                <w:rFonts w:ascii="Calibri" w:eastAsia="Times New Roman" w:hAnsi="Calibri" w:cs="Calibri"/>
+                <w:color w:val="222222"/>
+                <w:sz w:val="20"/>
+                <w:szCs w:val="20"/>
+              </w:rPr>
+              <w:t>All privileged code is in the server-side API (the equivalent of Edge Functions in this architecture). The frontend only calls the API with a session cookie.</w:t>
             </w:r>
           </w:p>
         </w:tc>
@@ -2392,17 +2392,17 @@
                 <w:rFonts w:ascii="Calibri" w:eastAsia="Times New Roman" w:hAnsi="Calibri" w:cs="Calibri"/>
                 <w:b/>
                 <w:bCs/>
-                <w:color w:val="1C2333"/>
-                <w:sz w:val="20"/>
-                <w:szCs w:val="20"/>
-              </w:rPr>
-            </w:pPr>
-            <w:r>
-              <w:rPr>
-                <w:rFonts w:ascii="Calibri" w:eastAsia="Times New Roman" w:hAnsi="Calibri" w:cs="Calibri"/>
-                <w:b/>
-                <w:bCs/>
-                <w:color w:val="1C2333"/>
+                <w:color w:val="222222"/>
+                <w:sz w:val="20"/>
+                <w:szCs w:val="20"/>
+              </w:rPr>
+            </w:pPr>
+            <w:r>
+              <w:rPr>
+                <w:rFonts w:ascii="Calibri" w:eastAsia="Times New Roman" w:hAnsi="Calibri" w:cs="Calibri"/>
+                <w:b/>
+                <w:bCs/>
+                <w:color w:val="222222"/>
                 <w:sz w:val="20"/>
                 <w:szCs w:val="20"/>
               </w:rPr>
@@ -2413,7 +2413,7 @@
       </w:tr>
       <w:tr>
         <w:trPr>
-          <w:divId w:val="1865942089"/>
+          <w:divId w:val="1891065320"/>
         </w:trPr>
         <w:tc>
           <w:tcPr>
@@ -2437,15 +2437,15 @@
               <w:spacing w:before="180" w:after="180"/>
               <w:rPr>
                 <w:rFonts w:ascii="Calibri" w:eastAsia="Times New Roman" w:hAnsi="Calibri" w:cs="Calibri"/>
-                <w:color w:val="1C2333"/>
-                <w:sz w:val="20"/>
-                <w:szCs w:val="20"/>
-              </w:rPr>
-            </w:pPr>
-            <w:r>
-              <w:rPr>
-                <w:rFonts w:ascii="Calibri" w:eastAsia="Times New Roman" w:hAnsi="Calibri" w:cs="Calibri"/>
-                <w:color w:val="1C2333"/>
+                <w:color w:val="222222"/>
+                <w:sz w:val="20"/>
+                <w:szCs w:val="20"/>
+              </w:rPr>
+            </w:pPr>
+            <w:r>
+              <w:rPr>
+                <w:rFonts w:ascii="Calibri" w:eastAsia="Times New Roman" w:hAnsi="Calibri" w:cs="Calibri"/>
+                <w:color w:val="222222"/>
                 <w:sz w:val="20"/>
                 <w:szCs w:val="20"/>
               </w:rPr>
@@ -2475,15 +2475,15 @@
               <w:spacing w:before="180" w:after="180"/>
               <w:rPr>
                 <w:rFonts w:ascii="Calibri" w:eastAsia="Times New Roman" w:hAnsi="Calibri" w:cs="Calibri"/>
-                <w:color w:val="1C2333"/>
-                <w:sz w:val="20"/>
-                <w:szCs w:val="20"/>
-              </w:rPr>
-            </w:pPr>
-            <w:r>
-              <w:rPr>
-                <w:rFonts w:ascii="Calibri" w:eastAsia="Times New Roman" w:hAnsi="Calibri" w:cs="Calibri"/>
-                <w:color w:val="1C2333"/>
+                <w:color w:val="222222"/>
+                <w:sz w:val="20"/>
+                <w:szCs w:val="20"/>
+              </w:rPr>
+            </w:pPr>
+            <w:r>
+              <w:rPr>
+                <w:rFonts w:ascii="Calibri" w:eastAsia="Times New Roman" w:hAnsi="Calibri" w:cs="Calibri"/>
+                <w:color w:val="222222"/>
                 <w:sz w:val="20"/>
                 <w:szCs w:val="20"/>
               </w:rPr>
@@ -2513,19 +2513,19 @@
               <w:spacing w:before="180" w:after="180"/>
               <w:rPr>
                 <w:rFonts w:ascii="Calibri" w:eastAsia="Times New Roman" w:hAnsi="Calibri" w:cs="Calibri"/>
-                <w:color w:val="1C2333"/>
-                <w:sz w:val="20"/>
-                <w:szCs w:val="20"/>
-              </w:rPr>
-            </w:pPr>
-            <w:r>
-              <w:rPr>
-                <w:rFonts w:ascii="Calibri" w:eastAsia="Times New Roman" w:hAnsi="Calibri" w:cs="Calibri"/>
-                <w:color w:val="1C2333"/>
-                <w:sz w:val="20"/>
-                <w:szCs w:val="20"/>
-              </w:rPr>
-              <w:t>Not applicable — no buckets. Files are RLS-protected database rows. If we later move to object storage for scale, files will be private-only with short-lived signed URLs, never public buckets.</w:t>
+                <w:color w:val="222222"/>
+                <w:sz w:val="20"/>
+                <w:szCs w:val="20"/>
+              </w:rPr>
+            </w:pPr>
+            <w:r>
+              <w:rPr>
+                <w:rFonts w:ascii="Calibri" w:eastAsia="Times New Roman" w:hAnsi="Calibri" w:cs="Calibri"/>
+                <w:color w:val="222222"/>
+                <w:sz w:val="20"/>
+                <w:szCs w:val="20"/>
+              </w:rPr>
+              <w:t>Not applicable — no buckets. Files are RLS-protected database rows. If files later move to object storage for scale, they will be private-only with short-lived signed URLs, never public buckets.</w:t>
             </w:r>
           </w:p>
         </w:tc>
@@ -2554,17 +2554,17 @@
                 <w:rFonts w:ascii="Calibri" w:eastAsia="Times New Roman" w:hAnsi="Calibri" w:cs="Calibri"/>
                 <w:b/>
                 <w:bCs/>
-                <w:color w:val="1C2333"/>
-                <w:sz w:val="20"/>
-                <w:szCs w:val="20"/>
-              </w:rPr>
-            </w:pPr>
-            <w:r>
-              <w:rPr>
-                <w:rFonts w:ascii="Calibri" w:eastAsia="Times New Roman" w:hAnsi="Calibri" w:cs="Calibri"/>
-                <w:b/>
-                <w:bCs/>
-                <w:color w:val="1C2333"/>
+                <w:color w:val="222222"/>
+                <w:sz w:val="20"/>
+                <w:szCs w:val="20"/>
+              </w:rPr>
+            </w:pPr>
+            <w:r>
+              <w:rPr>
+                <w:rFonts w:ascii="Calibri" w:eastAsia="Times New Roman" w:hAnsi="Calibri" w:cs="Calibri"/>
+                <w:b/>
+                <w:bCs/>
+                <w:color w:val="222222"/>
                 <w:sz w:val="20"/>
                 <w:szCs w:val="20"/>
               </w:rPr>
@@ -2575,7 +2575,7 @@
       </w:tr>
       <w:tr>
         <w:trPr>
-          <w:divId w:val="1865942089"/>
+          <w:divId w:val="1891065320"/>
         </w:trPr>
         <w:tc>
           <w:tcPr>
@@ -2599,15 +2599,15 @@
               <w:spacing w:before="180" w:after="180"/>
               <w:rPr>
                 <w:rFonts w:ascii="Calibri" w:eastAsia="Times New Roman" w:hAnsi="Calibri" w:cs="Calibri"/>
-                <w:color w:val="1C2333"/>
-                <w:sz w:val="20"/>
-                <w:szCs w:val="20"/>
-              </w:rPr>
-            </w:pPr>
-            <w:r>
-              <w:rPr>
-                <w:rFonts w:ascii="Calibri" w:eastAsia="Times New Roman" w:hAnsi="Calibri" w:cs="Calibri"/>
-                <w:color w:val="1C2333"/>
+                <w:color w:val="222222"/>
+                <w:sz w:val="20"/>
+                <w:szCs w:val="20"/>
+              </w:rPr>
+            </w:pPr>
+            <w:r>
+              <w:rPr>
+                <w:rFonts w:ascii="Calibri" w:eastAsia="Times New Roman" w:hAnsi="Calibri" w:cs="Calibri"/>
+                <w:color w:val="222222"/>
                 <w:sz w:val="20"/>
                 <w:szCs w:val="20"/>
               </w:rPr>
@@ -2637,15 +2637,15 @@
               <w:spacing w:before="180" w:after="180"/>
               <w:rPr>
                 <w:rFonts w:ascii="Calibri" w:eastAsia="Times New Roman" w:hAnsi="Calibri" w:cs="Calibri"/>
-                <w:color w:val="1C2333"/>
-                <w:sz w:val="20"/>
-                <w:szCs w:val="20"/>
-              </w:rPr>
-            </w:pPr>
-            <w:r>
-              <w:rPr>
-                <w:rFonts w:ascii="Calibri" w:eastAsia="Times New Roman" w:hAnsi="Calibri" w:cs="Calibri"/>
-                <w:color w:val="1C2333"/>
+                <w:color w:val="222222"/>
+                <w:sz w:val="20"/>
+                <w:szCs w:val="20"/>
+              </w:rPr>
+            </w:pPr>
+            <w:r>
+              <w:rPr>
+                <w:rFonts w:ascii="Calibri" w:eastAsia="Times New Roman" w:hAnsi="Calibri" w:cs="Calibri"/>
+                <w:color w:val="222222"/>
                 <w:sz w:val="20"/>
                 <w:szCs w:val="20"/>
               </w:rPr>
@@ -2675,39 +2675,19 @@
               <w:spacing w:before="180" w:after="180"/>
               <w:rPr>
                 <w:rFonts w:ascii="Calibri" w:eastAsia="Times New Roman" w:hAnsi="Calibri" w:cs="Calibri"/>
-                <w:color w:val="1C2333"/>
-                <w:sz w:val="20"/>
-                <w:szCs w:val="20"/>
-              </w:rPr>
-            </w:pPr>
-            <w:r>
-              <w:rPr>
-                <w:rFonts w:ascii="Calibri" w:eastAsia="Times New Roman" w:hAnsi="Calibri" w:cs="Calibri"/>
-                <w:color w:val="1C2333"/>
-                <w:sz w:val="20"/>
-                <w:szCs w:val="20"/>
-              </w:rPr>
-              <w:t xml:space="preserve">Applies to the </w:t>
-            </w:r>
-            <w:r>
-              <w:rPr>
-                <w:rFonts w:ascii="Calibri" w:eastAsia="Times New Roman" w:hAnsi="Calibri" w:cs="Calibri"/>
-                <w:b/>
-                <w:bCs/>
-                <w:color w:val="1C2333"/>
-                <w:sz w:val="20"/>
-                <w:szCs w:val="20"/>
-              </w:rPr>
-              <w:t>GitHub and Railway accounts</w:t>
-            </w:r>
-            <w:r>
-              <w:rPr>
-                <w:rFonts w:ascii="Calibri" w:eastAsia="Times New Roman" w:hAnsi="Calibri" w:cs="Calibri"/>
-                <w:color w:val="1C2333"/>
-                <w:sz w:val="20"/>
-                <w:szCs w:val="20"/>
-              </w:rPr>
-              <w:t xml:space="preserve"> that control this infrastructure. Action for the account owner: enable 2FA on both. In-app MFA for admin logins is on the pre-production list.</w:t>
+                <w:color w:val="222222"/>
+                <w:sz w:val="20"/>
+                <w:szCs w:val="20"/>
+              </w:rPr>
+            </w:pPr>
+            <w:r>
+              <w:rPr>
+                <w:rFonts w:ascii="Calibri" w:eastAsia="Times New Roman" w:hAnsi="Calibri" w:cs="Calibri"/>
+                <w:color w:val="222222"/>
+                <w:sz w:val="20"/>
+                <w:szCs w:val="20"/>
+              </w:rPr>
+              <w:t>Applies to the source-control and hosting accounts that control the infrastructure. Action for the account owner: enable 2FA on both. In-app MFA for admin logins is on the pre-production list.</w:t>
             </w:r>
           </w:p>
         </w:tc>
@@ -2736,17 +2716,17 @@
                 <w:rFonts w:ascii="Calibri" w:eastAsia="Times New Roman" w:hAnsi="Calibri" w:cs="Calibri"/>
                 <w:b/>
                 <w:bCs/>
-                <w:color w:val="1C2333"/>
-                <w:sz w:val="20"/>
-                <w:szCs w:val="20"/>
-              </w:rPr>
-            </w:pPr>
-            <w:r>
-              <w:rPr>
-                <w:rFonts w:ascii="Calibri" w:eastAsia="Times New Roman" w:hAnsi="Calibri" w:cs="Calibri"/>
-                <w:b/>
-                <w:bCs/>
-                <w:color w:val="1C2333"/>
+                <w:color w:val="222222"/>
+                <w:sz w:val="20"/>
+                <w:szCs w:val="20"/>
+              </w:rPr>
+            </w:pPr>
+            <w:r>
+              <w:rPr>
+                <w:rFonts w:ascii="Calibri" w:eastAsia="Times New Roman" w:hAnsi="Calibri" w:cs="Calibri"/>
+                <w:b/>
+                <w:bCs/>
+                <w:color w:val="222222"/>
                 <w:sz w:val="20"/>
                 <w:szCs w:val="20"/>
               </w:rPr>
@@ -2757,7 +2737,7 @@
       </w:tr>
       <w:tr>
         <w:trPr>
-          <w:divId w:val="1865942089"/>
+          <w:divId w:val="1891065320"/>
         </w:trPr>
         <w:tc>
           <w:tcPr>
@@ -2781,15 +2761,15 @@
               <w:spacing w:before="180" w:after="180"/>
               <w:rPr>
                 <w:rFonts w:ascii="Calibri" w:eastAsia="Times New Roman" w:hAnsi="Calibri" w:cs="Calibri"/>
-                <w:color w:val="1C2333"/>
-                <w:sz w:val="20"/>
-                <w:szCs w:val="20"/>
-              </w:rPr>
-            </w:pPr>
-            <w:r>
-              <w:rPr>
-                <w:rFonts w:ascii="Calibri" w:eastAsia="Times New Roman" w:hAnsi="Calibri" w:cs="Calibri"/>
-                <w:color w:val="1C2333"/>
+                <w:color w:val="222222"/>
+                <w:sz w:val="20"/>
+                <w:szCs w:val="20"/>
+              </w:rPr>
+            </w:pPr>
+            <w:r>
+              <w:rPr>
+                <w:rFonts w:ascii="Calibri" w:eastAsia="Times New Roman" w:hAnsi="Calibri" w:cs="Calibri"/>
+                <w:color w:val="222222"/>
                 <w:sz w:val="20"/>
                 <w:szCs w:val="20"/>
               </w:rPr>
@@ -2819,15 +2799,15 @@
               <w:spacing w:before="180" w:after="180"/>
               <w:rPr>
                 <w:rFonts w:ascii="Calibri" w:eastAsia="Times New Roman" w:hAnsi="Calibri" w:cs="Calibri"/>
-                <w:color w:val="1C2333"/>
-                <w:sz w:val="20"/>
-                <w:szCs w:val="20"/>
-              </w:rPr>
-            </w:pPr>
-            <w:r>
-              <w:rPr>
-                <w:rFonts w:ascii="Calibri" w:eastAsia="Times New Roman" w:hAnsi="Calibri" w:cs="Calibri"/>
-                <w:color w:val="1C2333"/>
+                <w:color w:val="222222"/>
+                <w:sz w:val="20"/>
+                <w:szCs w:val="20"/>
+              </w:rPr>
+            </w:pPr>
+            <w:r>
+              <w:rPr>
+                <w:rFonts w:ascii="Calibri" w:eastAsia="Times New Roman" w:hAnsi="Calibri" w:cs="Calibri"/>
+                <w:color w:val="222222"/>
                 <w:sz w:val="20"/>
                 <w:szCs w:val="20"/>
               </w:rPr>
@@ -2857,19 +2837,19 @@
               <w:spacing w:before="180" w:after="180"/>
               <w:rPr>
                 <w:rFonts w:ascii="Calibri" w:eastAsia="Times New Roman" w:hAnsi="Calibri" w:cs="Calibri"/>
-                <w:color w:val="1C2333"/>
-                <w:sz w:val="20"/>
-                <w:szCs w:val="20"/>
-              </w:rPr>
-            </w:pPr>
-            <w:r>
-              <w:rPr>
-                <w:rFonts w:ascii="Calibri" w:eastAsia="Times New Roman" w:hAnsi="Calibri" w:cs="Calibri"/>
-                <w:color w:val="1C2333"/>
-                <w:sz w:val="20"/>
-                <w:szCs w:val="20"/>
-              </w:rPr>
-              <w:t>Our equivalent is stronger than a generic scan: run verify-rls.ts after every migration; it fails if any policy regresses. It has already caught one real bug during development.</w:t>
+                <w:color w:val="222222"/>
+                <w:sz w:val="20"/>
+                <w:szCs w:val="20"/>
+              </w:rPr>
+            </w:pPr>
+            <w:r>
+              <w:rPr>
+                <w:rFonts w:ascii="Calibri" w:eastAsia="Times New Roman" w:hAnsi="Calibri" w:cs="Calibri"/>
+                <w:color w:val="222222"/>
+                <w:sz w:val="20"/>
+                <w:szCs w:val="20"/>
+              </w:rPr>
+              <w:t>The equivalent here is stronger than a generic scan: the RLS verification suite runs after every migration and fails if any policy regresses. It has already caught one real bug during development.</w:t>
             </w:r>
           </w:p>
         </w:tc>
@@ -2898,17 +2878,17 @@
                 <w:rFonts w:ascii="Calibri" w:eastAsia="Times New Roman" w:hAnsi="Calibri" w:cs="Calibri"/>
                 <w:b/>
                 <w:bCs/>
-                <w:color w:val="1C2333"/>
-                <w:sz w:val="20"/>
-                <w:szCs w:val="20"/>
-              </w:rPr>
-            </w:pPr>
-            <w:r>
-              <w:rPr>
-                <w:rFonts w:ascii="Calibri" w:eastAsia="Times New Roman" w:hAnsi="Calibri" w:cs="Calibri"/>
-                <w:b/>
-                <w:bCs/>
-                <w:color w:val="1C2333"/>
+                <w:color w:val="222222"/>
+                <w:sz w:val="20"/>
+                <w:szCs w:val="20"/>
+              </w:rPr>
+            </w:pPr>
+            <w:r>
+              <w:rPr>
+                <w:rFonts w:ascii="Calibri" w:eastAsia="Times New Roman" w:hAnsi="Calibri" w:cs="Calibri"/>
+                <w:b/>
+                <w:bCs/>
+                <w:color w:val="222222"/>
                 <w:sz w:val="20"/>
                 <w:szCs w:val="20"/>
               </w:rPr>
@@ -2919,7 +2899,7 @@
       </w:tr>
       <w:tr>
         <w:trPr>
-          <w:divId w:val="1865942089"/>
+          <w:divId w:val="1891065320"/>
         </w:trPr>
         <w:tc>
           <w:tcPr>
@@ -2943,15 +2923,15 @@
               <w:spacing w:before="180" w:after="180"/>
               <w:rPr>
                 <w:rFonts w:ascii="Calibri" w:eastAsia="Times New Roman" w:hAnsi="Calibri" w:cs="Calibri"/>
-                <w:color w:val="1C2333"/>
-                <w:sz w:val="20"/>
-                <w:szCs w:val="20"/>
-              </w:rPr>
-            </w:pPr>
-            <w:r>
-              <w:rPr>
-                <w:rFonts w:ascii="Calibri" w:eastAsia="Times New Roman" w:hAnsi="Calibri" w:cs="Calibri"/>
-                <w:color w:val="1C2333"/>
+                <w:color w:val="222222"/>
+                <w:sz w:val="20"/>
+                <w:szCs w:val="20"/>
+              </w:rPr>
+            </w:pPr>
+            <w:r>
+              <w:rPr>
+                <w:rFonts w:ascii="Calibri" w:eastAsia="Times New Roman" w:hAnsi="Calibri" w:cs="Calibri"/>
+                <w:color w:val="222222"/>
                 <w:sz w:val="20"/>
                 <w:szCs w:val="20"/>
               </w:rPr>
@@ -2981,15 +2961,15 @@
               <w:spacing w:before="180" w:after="180"/>
               <w:rPr>
                 <w:rFonts w:ascii="Calibri" w:eastAsia="Times New Roman" w:hAnsi="Calibri" w:cs="Calibri"/>
-                <w:color w:val="1C2333"/>
-                <w:sz w:val="20"/>
-                <w:szCs w:val="20"/>
-              </w:rPr>
-            </w:pPr>
-            <w:r>
-              <w:rPr>
-                <w:rFonts w:ascii="Calibri" w:eastAsia="Times New Roman" w:hAnsi="Calibri" w:cs="Calibri"/>
-                <w:color w:val="1C2333"/>
+                <w:color w:val="222222"/>
+                <w:sz w:val="20"/>
+                <w:szCs w:val="20"/>
+              </w:rPr>
+            </w:pPr>
+            <w:r>
+              <w:rPr>
+                <w:rFonts w:ascii="Calibri" w:eastAsia="Times New Roman" w:hAnsi="Calibri" w:cs="Calibri"/>
+                <w:color w:val="222222"/>
                 <w:sz w:val="20"/>
                 <w:szCs w:val="20"/>
               </w:rPr>
@@ -3019,19 +2999,19 @@
               <w:spacing w:before="180" w:after="180"/>
               <w:rPr>
                 <w:rFonts w:ascii="Calibri" w:eastAsia="Times New Roman" w:hAnsi="Calibri" w:cs="Calibri"/>
-                <w:color w:val="1C2333"/>
-                <w:sz w:val="20"/>
-                <w:szCs w:val="20"/>
-              </w:rPr>
-            </w:pPr>
-            <w:r>
-              <w:rPr>
-                <w:rFonts w:ascii="Calibri" w:eastAsia="Times New Roman" w:hAnsi="Calibri" w:cs="Calibri"/>
-                <w:color w:val="1C2333"/>
-                <w:sz w:val="20"/>
-                <w:szCs w:val="20"/>
-              </w:rPr>
-              <w:t>Agreed without reservation. The POC currently holds no real confidential data. Before real candidate dossiers (compensation, interview notes) are stored: professional security review, plus email verification, password reset, MFA, and token revocation.</w:t>
+                <w:color w:val="222222"/>
+                <w:sz w:val="20"/>
+                <w:szCs w:val="20"/>
+              </w:rPr>
+            </w:pPr>
+            <w:r>
+              <w:rPr>
+                <w:rFonts w:ascii="Calibri" w:eastAsia="Times New Roman" w:hAnsi="Calibri" w:cs="Calibri"/>
+                <w:color w:val="222222"/>
+                <w:sz w:val="20"/>
+                <w:szCs w:val="20"/>
+              </w:rPr>
+              <w:t>Agreed without reservation. No real confidential data is held during the proof-of-concept phase. Before real candidate dossiers (compensation, interview notes) are stored: professional security review, plus email verification, password reset, MFA, and token revocation.</w:t>
             </w:r>
           </w:p>
         </w:tc>
@@ -3060,17 +3040,17 @@
                 <w:rFonts w:ascii="Calibri" w:eastAsia="Times New Roman" w:hAnsi="Calibri" w:cs="Calibri"/>
                 <w:b/>
                 <w:bCs/>
-                <w:color w:val="1C2333"/>
-                <w:sz w:val="20"/>
-                <w:szCs w:val="20"/>
-              </w:rPr>
-            </w:pPr>
-            <w:r>
-              <w:rPr>
-                <w:rFonts w:ascii="Calibri" w:eastAsia="Times New Roman" w:hAnsi="Calibri" w:cs="Calibri"/>
-                <w:b/>
-                <w:bCs/>
-                <w:color w:val="1C2333"/>
+                <w:color w:val="222222"/>
+                <w:sz w:val="20"/>
+                <w:szCs w:val="20"/>
+              </w:rPr>
+            </w:pPr>
+            <w:r>
+              <w:rPr>
+                <w:rFonts w:ascii="Calibri" w:eastAsia="Times New Roman" w:hAnsi="Calibri" w:cs="Calibri"/>
+                <w:b/>
+                <w:bCs/>
+                <w:color w:val="222222"/>
                 <w:sz w:val="20"/>
                 <w:szCs w:val="20"/>
               </w:rPr>
@@ -3083,7 +3063,7 @@
     <w:p>
       <w:pPr>
         <w:pStyle w:val="Heading2"/>
-        <w:divId w:val="1865942089"/>
+        <w:divId w:val="1891065320"/>
         <w:rPr>
           <w:rFonts w:ascii="Calibri" w:eastAsia="Times New Roman" w:hAnsi="Calibri" w:cs="Calibri"/>
         </w:rPr>
@@ -3098,10 +3078,10 @@
     <w:p>
       <w:pPr>
         <w:pStyle w:val="callout"/>
-        <w:divId w:val="1865942089"/>
+        <w:divId w:val="1891065320"/>
         <w:rPr>
           <w:rFonts w:ascii="Calibri" w:hAnsi="Calibri" w:cs="Calibri"/>
-          <w:color w:val="1C2333"/>
+          <w:color w:val="222222"/>
           <w:sz w:val="22"/>
           <w:szCs w:val="22"/>
         </w:rPr>
@@ -3109,7 +3089,7 @@
       <w:r>
         <w:rPr>
           <w:rFonts w:ascii="Calibri" w:hAnsi="Calibri" w:cs="Calibri"/>
-          <w:color w:val="1C2333"/>
+          <w:color w:val="222222"/>
           <w:sz w:val="22"/>
           <w:szCs w:val="22"/>
         </w:rPr>
@@ -3120,7 +3100,7 @@
           <w:rFonts w:ascii="Calibri" w:hAnsi="Calibri" w:cs="Calibri"/>
           <w:i/>
           <w:iCs/>
-          <w:color w:val="1C2333"/>
+          <w:color w:val="222222"/>
           <w:sz w:val="22"/>
           <w:szCs w:val="22"/>
         </w:rPr>
@@ -3129,7 +3109,7 @@
       <w:r>
         <w:rPr>
           <w:rFonts w:ascii="Calibri" w:hAnsi="Calibri" w:cs="Calibri"/>
-          <w:color w:val="1C2333"/>
+          <w:color w:val="222222"/>
           <w:sz w:val="22"/>
           <w:szCs w:val="22"/>
         </w:rPr>
@@ -3140,7 +3120,7 @@
           <w:rFonts w:ascii="Calibri" w:hAnsi="Calibri" w:cs="Calibri"/>
           <w:i/>
           <w:iCs/>
-          <w:color w:val="1C2333"/>
+          <w:color w:val="222222"/>
           <w:sz w:val="22"/>
           <w:szCs w:val="22"/>
         </w:rPr>
@@ -3149,7 +3129,7 @@
       <w:r>
         <w:rPr>
           <w:rFonts w:ascii="Calibri" w:hAnsi="Calibri" w:cs="Calibri"/>
-          <w:color w:val="1C2333"/>
+          <w:color w:val="222222"/>
           <w:sz w:val="22"/>
           <w:szCs w:val="22"/>
         </w:rPr>
@@ -3158,7 +3138,7 @@
       <w:r>
         <w:rPr>
           <w:rFonts w:ascii="Calibri" w:hAnsi="Calibri" w:cs="Calibri"/>
-          <w:color w:val="1C2333"/>
+          <w:color w:val="222222"/>
           <w:sz w:val="22"/>
           <w:szCs w:val="22"/>
         </w:rPr>
@@ -3169,7 +3149,7 @@
           <w:rFonts w:ascii="Calibri" w:hAnsi="Calibri" w:cs="Calibri"/>
           <w:b/>
           <w:bCs/>
-          <w:color w:val="1C2333"/>
+          <w:color w:val="222222"/>
           <w:sz w:val="22"/>
           <w:szCs w:val="22"/>
         </w:rPr>
@@ -3178,7 +3158,7 @@
       <w:r>
         <w:rPr>
           <w:rFonts w:ascii="Calibri" w:hAnsi="Calibri" w:cs="Calibri"/>
-          <w:color w:val="1C2333"/>
+          <w:color w:val="222222"/>
           <w:sz w:val="22"/>
           <w:szCs w:val="22"/>
         </w:rPr>
@@ -3188,7 +3168,7 @@
     <w:p>
       <w:pPr>
         <w:pStyle w:val="Heading2"/>
-        <w:divId w:val="1865942089"/>
+        <w:divId w:val="1891065320"/>
         <w:rPr>
           <w:rFonts w:ascii="Calibri" w:eastAsia="Times New Roman" w:hAnsi="Calibri" w:cs="Calibri"/>
         </w:rPr>
@@ -3197,17 +3177,16 @@
         <w:rPr>
           <w:rFonts w:ascii="Calibri" w:eastAsia="Times New Roman" w:hAnsi="Calibri" w:cs="Calibri"/>
         </w:rPr>
-        <w:lastRenderedPageBreak/>
-        <w:t>Executive-search readiness (added in migration 004)</w:t>
+        <w:t>Executive-search readiness</w:t>
       </w:r>
     </w:p>
     <w:p>
       <w:pPr>
         <w:pStyle w:val="NormalWeb"/>
-        <w:divId w:val="1865942089"/>
+        <w:divId w:val="1891065320"/>
         <w:rPr>
           <w:rFonts w:ascii="Calibri" w:hAnsi="Calibri" w:cs="Calibri"/>
-          <w:color w:val="1C2333"/>
+          <w:color w:val="222222"/>
           <w:sz w:val="22"/>
           <w:szCs w:val="22"/>
         </w:rPr>
@@ -3215,11 +3194,11 @@
       <w:r>
         <w:rPr>
           <w:rFonts w:ascii="Calibri" w:hAnsi="Calibri" w:cs="Calibri"/>
-          <w:color w:val="1C2333"/>
+          <w:color w:val="222222"/>
           <w:sz w:val="22"/>
           <w:szCs w:val="22"/>
         </w:rPr>
-        <w:t>The consultant's closing paragraph — résumés, compensation, interview notes, rankings, client information — is the direction this codebase now anticipates:</w:t>
+        <w:t>The consultant's closing paragraph — résumés, compensation, interview notes, rankings, client information — is the direction this architecture already anticipates:</w:t>
       </w:r>
     </w:p>
     <w:p>
@@ -3229,10 +3208,10 @@
           <w:numId w:val="1"/>
         </w:numPr>
         <w:spacing w:before="100" w:beforeAutospacing="1" w:after="100" w:afterAutospacing="1"/>
-        <w:divId w:val="1865942089"/>
+        <w:divId w:val="1891065320"/>
         <w:rPr>
           <w:rFonts w:ascii="Calibri" w:eastAsia="Times New Roman" w:hAnsi="Calibri" w:cs="Calibri"/>
-          <w:color w:val="1C2333"/>
+          <w:color w:val="222222"/>
           <w:sz w:val="22"/>
           <w:szCs w:val="22"/>
         </w:rPr>
@@ -3242,7 +3221,7 @@
           <w:rFonts w:ascii="Calibri" w:eastAsia="Times New Roman" w:hAnsi="Calibri" w:cs="Calibri"/>
           <w:b/>
           <w:bCs/>
-          <w:color w:val="1C2333"/>
+          <w:color w:val="222222"/>
           <w:sz w:val="22"/>
           <w:szCs w:val="22"/>
         </w:rPr>
@@ -3251,11 +3230,11 @@
       <w:r>
         <w:rPr>
           <w:rFonts w:ascii="Calibri" w:eastAsia="Times New Roman" w:hAnsi="Calibri" w:cs="Calibri"/>
-          <w:color w:val="1C2333"/>
+          <w:color w:val="222222"/>
           <w:sz w:val="22"/>
           <w:szCs w:val="22"/>
         </w:rPr>
-        <w:t xml:space="preserve"> client-company users see only their own company's positions and slates. Company assignment is admin-only, guarded at trigger level like role changes.</w:t>
+        <w:t xml:space="preserve"> client-company users see only their own company's positions and candidate slates. Company assignment is admin-only, guarded at the database-trigger level like role changes.</w:t>
       </w:r>
     </w:p>
     <w:p>
@@ -3265,10 +3244,10 @@
           <w:numId w:val="1"/>
         </w:numPr>
         <w:spacing w:before="100" w:beforeAutospacing="1" w:after="100" w:afterAutospacing="1"/>
-        <w:divId w:val="1865942089"/>
+        <w:divId w:val="1891065320"/>
         <w:rPr>
           <w:rFonts w:ascii="Calibri" w:eastAsia="Times New Roman" w:hAnsi="Calibri" w:cs="Calibri"/>
-          <w:color w:val="1C2333"/>
+          <w:color w:val="222222"/>
           <w:sz w:val="22"/>
           <w:szCs w:val="22"/>
         </w:rPr>
@@ -3278,7 +3257,7 @@
           <w:rFonts w:ascii="Calibri" w:eastAsia="Times New Roman" w:hAnsi="Calibri" w:cs="Calibri"/>
           <w:b/>
           <w:bCs/>
-          <w:color w:val="1C2333"/>
+          <w:color w:val="222222"/>
           <w:sz w:val="22"/>
           <w:szCs w:val="22"/>
         </w:rPr>
@@ -3287,20 +3266,20 @@
       <w:r>
         <w:rPr>
           <w:rFonts w:ascii="Calibri" w:eastAsia="Times New Roman" w:hAnsi="Calibri" w:cs="Calibri"/>
-          <w:color w:val="1C2333"/>
+          <w:color w:val="222222"/>
           <w:sz w:val="22"/>
           <w:szCs w:val="22"/>
         </w:rPr>
-        <w:t xml:space="preserve"> </w:t>
+        <w:t xml:space="preserve"> candidates appear to clien</w:t>
       </w:r>
       <w:r>
         <w:rPr>
           <w:rFonts w:ascii="Calibri" w:eastAsia="Times New Roman" w:hAnsi="Calibri" w:cs="Calibri"/>
-          <w:color w:val="1C2333"/>
+          <w:color w:val="222222"/>
           <w:sz w:val="22"/>
           <w:szCs w:val="22"/>
         </w:rPr>
-        <w:t>candidates appear to clients as anonymous (summary only) → identified (name + profile) → full (adds CV), controlled per-candidate by admins and enforced by RLS — not by the UI.</w:t>
+        <w:t>t companies as anonymous (summary only) → identified (name + profile) → full (adds CV), controlled per-candidate by admins and enforced by row-level security — not by the UI.</w:t>
       </w:r>
     </w:p>
     <w:p>
@@ -3310,10 +3289,10 @@
           <w:numId w:val="1"/>
         </w:numPr>
         <w:spacing w:before="100" w:beforeAutospacing="1" w:after="100" w:afterAutospacing="1"/>
-        <w:divId w:val="1865942089"/>
+        <w:divId w:val="1891065320"/>
         <w:rPr>
           <w:rFonts w:ascii="Calibri" w:eastAsia="Times New Roman" w:hAnsi="Calibri" w:cs="Calibri"/>
-          <w:color w:val="1C2333"/>
+          <w:color w:val="222222"/>
           <w:sz w:val="22"/>
           <w:szCs w:val="22"/>
         </w:rPr>
@@ -3323,7 +3302,7 @@
           <w:rFonts w:ascii="Calibri" w:eastAsia="Times New Roman" w:hAnsi="Calibri" w:cs="Calibri"/>
           <w:b/>
           <w:bCs/>
-          <w:color w:val="1C2333"/>
+          <w:color w:val="222222"/>
           <w:sz w:val="22"/>
           <w:szCs w:val="22"/>
         </w:rPr>
@@ -3332,11 +3311,11 @@
       <w:r>
         <w:rPr>
           <w:rFonts w:ascii="Calibri" w:eastAsia="Times New Roman" w:hAnsi="Calibri" w:cs="Calibri"/>
-          <w:color w:val="1C2333"/>
+          <w:color w:val="222222"/>
           <w:sz w:val="22"/>
           <w:szCs w:val="22"/>
         </w:rPr>
-        <w:t xml:space="preserve"> staff profile views, staff CV downloads, client slate views, and client CV downloads are all written to the append-only audit log.</w:t>
+        <w:t xml:space="preserve"> staff profile views, staff CV downloads, client slate views, and client CV downloads are all written to an append-only audit log.</w:t>
       </w:r>
     </w:p>
     <w:p>
@@ -3346,10 +3325,10 @@
           <w:numId w:val="1"/>
         </w:numPr>
         <w:spacing w:before="100" w:beforeAutospacing="1" w:after="100" w:afterAutospacing="1"/>
-        <w:divId w:val="1865942089"/>
+        <w:divId w:val="1891065320"/>
         <w:rPr>
           <w:rFonts w:ascii="Calibri" w:eastAsia="Times New Roman" w:hAnsi="Calibri" w:cs="Calibri"/>
-          <w:color w:val="1C2333"/>
+          <w:color w:val="222222"/>
           <w:sz w:val="22"/>
           <w:szCs w:val="22"/>
         </w:rPr>
@@ -3359,7 +3338,7 @@
           <w:rFonts w:ascii="Calibri" w:eastAsia="Times New Roman" w:hAnsi="Calibri" w:cs="Calibri"/>
           <w:b/>
           <w:bCs/>
-          <w:color w:val="1C2333"/>
+          <w:color w:val="222222"/>
           <w:sz w:val="22"/>
           <w:szCs w:val="22"/>
         </w:rPr>
@@ -3368,7 +3347,7 @@
       <w:r>
         <w:rPr>
           <w:rFonts w:ascii="Calibri" w:eastAsia="Times New Roman" w:hAnsi="Calibri" w:cs="Calibri"/>
-          <w:color w:val="1C2333"/>
+          <w:color w:val="222222"/>
           <w:sz w:val="22"/>
           <w:szCs w:val="22"/>
         </w:rPr>
@@ -3377,11 +3356,11 @@
       <w:r>
         <w:rPr>
           <w:rFonts w:ascii="Calibri" w:eastAsia="Times New Roman" w:hAnsi="Calibri" w:cs="Calibri"/>
-          <w:color w:val="1C2333"/>
+          <w:color w:val="222222"/>
           <w:sz w:val="22"/>
           <w:szCs w:val="22"/>
         </w:rPr>
-        <w:t>support has no access to recruiting tables. Future compensation and interview-note tables should follow the same pattern: separate tables, strictest-possible policies, read-audited.</w:t>
+        <w:t>support staff have no access to recruiting tables. Future compensation and interview-note tables should follow the same pattern: separate tables, strictest-possible policies, read-audited.</w:t>
       </w:r>
     </w:p>
     <w:sectPr>
@@ -3397,9 +3376,9 @@
 <file path=word/numbering.xml><?xml version="1.0" encoding="utf-8"?>
 <w:numbering xmlns:wpc="http://schemas.microsoft.com/office/word/2010/wordprocessingCanvas" xmlns:cx="http://schemas.microsoft.com/office/drawing/2014/chartex" xmlns:cx1="http://schemas.microsoft.com/office/drawing/2015/9/8/chartex" xmlns:cx2="http://schemas.microsoft.com/office/drawing/2015/10/21/chartex" xmlns:cx3="http://schemas.microsoft.com/office/drawing/2016/5/9/chartex" xmlns:cx4="http://schemas.microsoft.com/office/drawing/2016/5/10/chartex" xmlns:cx5="http://schemas.microsoft.com/office/drawing/2016/5/11/chartex" xmlns:cx6="http://schemas.microsoft.com/office/drawing/2016/5/12/chartex" xmlns:cx7="http://schemas.microsoft.com/office/drawing/2016/5/13/chartex" xmlns:cx8="http://schemas.microsoft.com/office/drawing/2016/5/14/chartex" xmlns:mc="http://schemas.openxmlformats.org/markup-compatibility/2006" xmlns:aink="http://schemas.microsoft.com/office/drawing/2016/ink" xmlns:am3d="http://schemas.microsoft.com/office/drawing/2017/model3d" xmlns:o="urn:schemas-microsoft-com:office:office" xmlns:oel="http://schemas.microsoft.com/office/2019/extlst" xmlns:r="http://schemas.openxmlformats.org/officeDocument/2006/relationships" xmlns:m="http://schemas.openxmlformats.org/officeDocument/2006/math" xmlns:v="urn:schemas-microsoft-com:vml" xmlns:wp14="http://schemas.microsoft.com/office/word/2010/wordprocessingDrawing" xmlns:wp="http://schemas.openxmlformats.org/drawingml/2006/wordprocessingDrawing" xmlns:w10="urn:schemas-microsoft-com:office:word" xmlns:w="http://schemas.openxmlformats.org/wordprocessingml/2006/main" xmlns:w14="http://schemas.microsoft.com/office/word/2010/wordml" xmlns:w15="http://schemas.microsoft.com/office/word/2012/wordml" xmlns:w16cex="http://schemas.microsoft.com/office/word/2018/wordml/cex" xmlns:w16cid="http://schemas.microsoft.com/office/word/2016/wordml/cid" xmlns:w16="http://schemas.microsoft.com/office/word/2018/wordml" xmlns:w16du="http://schemas.microsoft.com/office/word/2023/wordml/word16du" xmlns:w16sdtdh="http://schemas.microsoft.com/office/word/2020/wordml/sdtdatahash" xmlns:w16sdtfl="http://schemas.microsoft.com/office/word/2024/wordml/sdtformatlock" xmlns:w16se="http://schemas.microsoft.com/office/word/2015/wordml/symex" xmlns:wpg="http://schemas.microsoft.com/office/word/2010/wordprocessingGroup" xmlns:wpi="http://schemas.microsoft.com/office/word/2010/wordprocessingInk" xmlns:wne="http://schemas.microsoft.com/office/word/2006/wordml" xmlns:wps="http://schemas.microsoft.com/office/word/2010/wordprocessingShape" mc:Ignorable="w14 w15 w16se w16cid w16 w16cex w16sdtdh w16sdtfl w16du wp14">
   <w:abstractNum w:abstractNumId="0" w15:restartNumberingAfterBreak="0">
-    <w:nsid w:val="2DBC3D83"/>
+    <w:nsid w:val="59D50EE0"/>
     <w:multiLevelType w:val="multilevel"/>
-    <w:tmpl w:val="9E06F124"/>
+    <w:tmpl w:val="408A4B56"/>
     <w:lvl w:ilvl="0">
       <w:start w:val="1"/>
       <w:numFmt w:val="bullet"/>
@@ -3545,7 +3524,7 @@
       </w:rPr>
     </w:lvl>
   </w:abstractNum>
-  <w:num w:numId="1" w16cid:durableId="1259480362">
+  <w:num w:numId="1" w16cid:durableId="1537309269">
     <w:abstractNumId w:val="0"/>
   </w:num>
 </w:numbering>
@@ -3957,7 +3936,7 @@
     <w:qFormat/>
     <w:pPr>
       <w:pBdr>
-        <w:bottom w:val="single" w:sz="18" w:space="5" w:color="C9A227"/>
+        <w:bottom w:val="single" w:sz="12" w:space="5" w:color="1F3352"/>
       </w:pBdr>
       <w:spacing w:before="100" w:beforeAutospacing="1" w:after="100" w:afterAutospacing="1"/>
       <w:outlineLvl w:val="0"/>
@@ -3965,7 +3944,7 @@
     <w:rPr>
       <w:b/>
       <w:bCs/>
-      <w:color w:val="0A1128"/>
+      <w:color w:val="1F3352"/>
       <w:kern w:val="36"/>
       <w:sz w:val="40"/>
       <w:szCs w:val="40"/>
@@ -3984,7 +3963,7 @@
     <w:rPr>
       <w:b/>
       <w:bCs/>
-      <w:color w:val="0A1128"/>
+      <w:color w:val="1F3352"/>
       <w:sz w:val="28"/>
       <w:szCs w:val="28"/>
     </w:rPr>
@@ -4076,7 +4055,7 @@
       <w:spacing w:before="100" w:beforeAutospacing="1" w:after="100" w:afterAutospacing="1"/>
     </w:pPr>
     <w:rPr>
-      <w:color w:val="4C566A"/>
+      <w:color w:val="555555"/>
       <w:sz w:val="20"/>
       <w:szCs w:val="20"/>
     </w:rPr>
@@ -4086,9 +4065,9 @@
     <w:basedOn w:val="Normal"/>
     <w:pPr>
       <w:pBdr>
-        <w:left w:val="single" w:sz="24" w:space="11" w:color="C9A227"/>
+        <w:left w:val="single" w:sz="24" w:space="11" w:color="1F3352"/>
       </w:pBdr>
-      <w:shd w:val="clear" w:color="auto" w:fill="F4EFE2"/>
+      <w:shd w:val="clear" w:color="auto" w:fill="EEF2F8"/>
       <w:spacing w:before="100" w:beforeAutospacing="1" w:after="100" w:afterAutospacing="1"/>
     </w:pPr>
   </w:style>

</xml_diff>